<commit_message>
Report: fill in repository and pipeline run URLs
</commit_message>
<xml_diff>
--- a/report/Work1-Report.docx
+++ b/report/Work1-Report.docx
@@ -881,41 +881,157 @@
           <w:i w:val="0"/>
           <w:sz w:val="22"/>
         </w:rPr>
-        <w:t>Deliverable links. The repository and the pipeline run are produced from this folder; the two addresses are filled in after the first push, because a public remote requires the student's own GitHub account:</w:t>
+        <w:t>Deliverables. The project is published as a public repository, and the pipeline ran on the first push and completed successfully:</w:t>
       </w:r>
     </w:p>
-    <w:p>
-      <w:pPr>
-        <w:shd w:fill="F4F6FA"/>
-        <w:spacing w:before="0" w:after="0" w:line="200" w:lineRule="exact"/>
-        <w:ind w:left="113" w:right="113"/>
-      </w:pPr>
-      <w:r>
-        <w:rPr>
-          <w:rFonts w:ascii="Consolas" w:hAnsi="Consolas" w:eastAsia="Consolas"/>
-          <w:b w:val="0"/>
-          <w:i w:val="0"/>
-          <w:sz w:val="15"/>
-        </w:rPr>
-        <w:t>Repository:  &lt;to be filled after git push&gt;</w:t>
-      </w:r>
-    </w:p>
-    <w:p>
-      <w:pPr>
-        <w:shd w:fill="F4F6FA"/>
-        <w:spacing w:before="0" w:after="0" w:line="200" w:lineRule="exact"/>
-        <w:ind w:left="113" w:right="113"/>
-      </w:pPr>
-      <w:r>
-        <w:rPr>
-          <w:rFonts w:ascii="Consolas" w:hAnsi="Consolas" w:eastAsia="Consolas"/>
-          <w:b w:val="0"/>
-          <w:i w:val="0"/>
-          <w:sz w:val="15"/>
-        </w:rPr>
-        <w:t>Pipeline:    &lt;to be filled after the first Actions run&gt;</w:t>
-      </w:r>
-    </w:p>
+    <w:tbl>
+      <w:tblPr>
+        <w:tblStyle w:val="TableGrid"/>
+        <w:tblW w:type="auto" w:w="0"/>
+        <w:jc w:val="center"/>
+        <w:tblLook w:firstColumn="1" w:firstRow="1" w:lastColumn="0" w:lastRow="0" w:noHBand="0" w:noVBand="1" w:val="04A0"/>
+      </w:tblPr>
+      <w:tblGrid>
+        <w:gridCol w:w="4592"/>
+        <w:gridCol w:w="4592"/>
+      </w:tblGrid>
+      <w:tr>
+        <w:trPr>
+          <w:cantSplit/>
+          <w:tblHeader w:val="true"/>
+        </w:trPr>
+        <w:tc>
+          <w:tcPr>
+            <w:tcW w:type="dxa" w:w="2494"/>
+          </w:tcPr>
+          <w:p>
+            <w:pPr>
+              <w:spacing w:before="60" w:after="60" w:line="271" w:lineRule="auto"/>
+              <w:jc w:val="center"/>
+            </w:pPr>
+            <w:r>
+              <w:rPr>
+                <w:rFonts w:ascii="Calibri" w:hAnsi="Calibri" w:eastAsia="Calibri"/>
+                <w:b/>
+                <w:i w:val="0"/>
+                <w:sz w:val="16"/>
+              </w:rPr>
+              <w:t>Deliverable</w:t>
+            </w:r>
+          </w:p>
+        </w:tc>
+        <w:tc>
+          <w:tcPr>
+            <w:tcW w:type="dxa" w:w="6350"/>
+          </w:tcPr>
+          <w:p>
+            <w:pPr>
+              <w:spacing w:before="60" w:after="60" w:line="271" w:lineRule="auto"/>
+              <w:jc w:val="center"/>
+            </w:pPr>
+            <w:r>
+              <w:rPr>
+                <w:rFonts w:ascii="Calibri" w:hAnsi="Calibri" w:eastAsia="Calibri"/>
+                <w:b/>
+                <w:i w:val="0"/>
+                <w:sz w:val="16"/>
+              </w:rPr>
+              <w:t>Location</w:t>
+            </w:r>
+          </w:p>
+        </w:tc>
+      </w:tr>
+      <w:tr>
+        <w:trPr>
+          <w:cantSplit/>
+        </w:trPr>
+        <w:tc>
+          <w:tcPr>
+            <w:tcW w:type="dxa" w:w="2494"/>
+          </w:tcPr>
+          <w:p>
+            <w:pPr>
+              <w:spacing w:before="60" w:after="60" w:line="271" w:lineRule="auto"/>
+              <w:jc w:val="center"/>
+            </w:pPr>
+            <w:r>
+              <w:rPr>
+                <w:rFonts w:ascii="Calibri" w:hAnsi="Calibri" w:eastAsia="Calibri"/>
+                <w:b w:val="0"/>
+                <w:i w:val="0"/>
+                <w:sz w:val="16"/>
+              </w:rPr>
+              <w:t>Repository</w:t>
+            </w:r>
+          </w:p>
+        </w:tc>
+        <w:tc>
+          <w:tcPr>
+            <w:tcW w:type="dxa" w:w="6350"/>
+          </w:tcPr>
+          <w:p>
+            <w:pPr>
+              <w:spacing w:before="60" w:after="60" w:line="271" w:lineRule="auto"/>
+              <w:jc w:val="left"/>
+            </w:pPr>
+            <w:r>
+              <w:rPr>
+                <w:rFonts w:ascii="Calibri" w:hAnsi="Calibri" w:eastAsia="Calibri"/>
+                <w:b w:val="0"/>
+                <w:i w:val="0"/>
+                <w:sz w:val="16"/>
+              </w:rPr>
+              <w:t>https://github.com/killer-4087-2/22320110-HDU-CS4-26-27-1-Information-Security</w:t>
+            </w:r>
+          </w:p>
+        </w:tc>
+      </w:tr>
+      <w:tr>
+        <w:trPr>
+          <w:cantSplit/>
+        </w:trPr>
+        <w:tc>
+          <w:tcPr>
+            <w:tcW w:type="dxa" w:w="2494"/>
+          </w:tcPr>
+          <w:p>
+            <w:pPr>
+              <w:spacing w:before="60" w:after="60" w:line="271" w:lineRule="auto"/>
+              <w:jc w:val="center"/>
+            </w:pPr>
+            <w:r>
+              <w:rPr>
+                <w:rFonts w:ascii="Calibri" w:hAnsi="Calibri" w:eastAsia="Calibri"/>
+                <w:b w:val="0"/>
+                <w:i w:val="0"/>
+                <w:sz w:val="16"/>
+              </w:rPr>
+              <w:t>Successful pipeline run (run #1)</w:t>
+            </w:r>
+          </w:p>
+        </w:tc>
+        <w:tc>
+          <w:tcPr>
+            <w:tcW w:type="dxa" w:w="6350"/>
+          </w:tcPr>
+          <w:p>
+            <w:pPr>
+              <w:spacing w:before="60" w:after="60" w:line="271" w:lineRule="auto"/>
+              <w:jc w:val="left"/>
+            </w:pPr>
+            <w:r>
+              <w:rPr>
+                <w:rFonts w:ascii="Calibri" w:hAnsi="Calibri" w:eastAsia="Calibri"/>
+                <w:b w:val="0"/>
+                <w:i w:val="0"/>
+                <w:sz w:val="16"/>
+              </w:rPr>
+              <w:t>https://github.com/killer-4087-2/22320110-HDU-CS4-26-27-1-Information-Security/actions/runs/39233093705</w:t>
+            </w:r>
+          </w:p>
+        </w:tc>
+      </w:tr>
+    </w:tbl>
     <w:p>
       <w:pPr>
         <w:keepNext/>

</xml_diff>

<commit_message>
CVE reproduction: add Docker build, fixed-image compose and verification script
</commit_message>
<xml_diff>
--- a/report/Work1-Report.docx
+++ b/report/Work1-Report.docx
@@ -3750,7 +3750,7 @@
     </w:p>
     <w:p>
       <w:pPr>
-        <w:spacing w:before="0" w:after="160" w:line="322" w:lineRule="auto"/>
+        <w:spacing w:before="0" w:after="80" w:line="322" w:lineRule="auto"/>
         <w:jc w:val="both"/>
       </w:pPr>
       <w:r>
@@ -3760,7 +3760,7 @@
           <w:i w:val="0"/>
           <w:sz w:val="22"/>
         </w:rPr>
-        <w:t>Docker is not installed on the machine used for this work, so the vulhub scenario was reproduced natively: the same application source and the same runtime version, started directly instead of in a container. The vulnerability lives in the Node.js runtime, so the packaging is irrelevant to the result. The exact Docker commands are given for completeness.</w:t>
+        <w:t>The scenario runs in Docker, which is what the manual expects: the vulhub application is built into an image on the official node base image, and two images differ only in the runtime tag. The first run uses node:8.5.0, the second node:8.6.0.</w:t>
       </w:r>
     </w:p>
     <w:p>
@@ -3776,7 +3776,7 @@
           <w:i w:val="0"/>
           <w:sz w:val="15"/>
         </w:rPr>
-        <w:t># official path (needs Docker)</w:t>
+        <w:t># cve/CVE-2017-14849/docker-compose.yml</w:t>
       </w:r>
     </w:p>
     <w:p>
@@ -3792,7 +3792,7 @@
           <w:i w:val="0"/>
           <w:sz w:val="15"/>
         </w:rPr>
-        <w:t>git clone https://github.com/vulhub/vulhub.git</w:t>
+        <w:t>services:</w:t>
       </w:r>
     </w:p>
     <w:p>
@@ -3808,7 +3808,7 @@
           <w:i w:val="0"/>
           <w:sz w:val="15"/>
         </w:rPr>
-        <w:t>cd vulhub/node/CVE-2017-14849 &amp;&amp; docker compose up -d</w:t>
+        <w:t xml:space="preserve">  node:</w:t>
       </w:r>
     </w:p>
     <w:p>
@@ -3824,6 +3824,165 @@
           <w:i w:val="0"/>
           <w:sz w:val="15"/>
         </w:rPr>
+        <w:t xml:space="preserve">    build: .</w:t>
+      </w:r>
+    </w:p>
+    <w:p>
+      <w:pPr>
+        <w:shd w:fill="F4F6FA"/>
+        <w:spacing w:before="0" w:after="0" w:line="200" w:lineRule="exact"/>
+        <w:ind w:left="113" w:right="113"/>
+      </w:pPr>
+      <w:r>
+        <w:rPr>
+          <w:rFonts w:ascii="Consolas" w:hAnsi="Consolas" w:eastAsia="Consolas"/>
+          <w:b w:val="0"/>
+          <w:i w:val="0"/>
+          <w:sz w:val="15"/>
+        </w:rPr>
+        <w:t xml:space="preserve">    volumes:</w:t>
+      </w:r>
+    </w:p>
+    <w:p>
+      <w:pPr>
+        <w:shd w:fill="F4F6FA"/>
+        <w:spacing w:before="0" w:after="0" w:line="200" w:lineRule="exact"/>
+        <w:ind w:left="113" w:right="113"/>
+      </w:pPr>
+      <w:r>
+        <w:rPr>
+          <w:rFonts w:ascii="Consolas" w:hAnsi="Consolas" w:eastAsia="Consolas"/>
+          <w:b w:val="0"/>
+          <w:i w:val="0"/>
+          <w:sz w:val="15"/>
+        </w:rPr>
+        <w:t xml:space="preserve">      - ./www:/usr/src/www</w:t>
+      </w:r>
+    </w:p>
+    <w:p>
+      <w:pPr>
+        <w:shd w:fill="F4F6FA"/>
+        <w:spacing w:before="0" w:after="0" w:line="200" w:lineRule="exact"/>
+        <w:ind w:left="113" w:right="113"/>
+      </w:pPr>
+      <w:r>
+        <w:rPr>
+          <w:rFonts w:ascii="Consolas" w:hAnsi="Consolas" w:eastAsia="Consolas"/>
+          <w:b w:val="0"/>
+          <w:i w:val="0"/>
+          <w:sz w:val="15"/>
+        </w:rPr>
+        <w:t xml:space="preserve">      - ./secret.txt:/usr/src/secret.txt:ro</w:t>
+      </w:r>
+    </w:p>
+    <w:p>
+      <w:pPr>
+        <w:shd w:fill="F4F6FA"/>
+        <w:spacing w:before="0" w:after="0" w:line="200" w:lineRule="exact"/>
+        <w:ind w:left="113" w:right="113"/>
+      </w:pPr>
+      <w:r>
+        <w:rPr>
+          <w:rFonts w:ascii="Consolas" w:hAnsi="Consolas" w:eastAsia="Consolas"/>
+          <w:b w:val="0"/>
+          <w:i w:val="0"/>
+          <w:sz w:val="15"/>
+        </w:rPr>
+        <w:t xml:space="preserve">    ports:</w:t>
+      </w:r>
+    </w:p>
+    <w:p>
+      <w:pPr>
+        <w:shd w:fill="F4F6FA"/>
+        <w:spacing w:before="0" w:after="0" w:line="200" w:lineRule="exact"/>
+        <w:ind w:left="113" w:right="113"/>
+      </w:pPr>
+      <w:r>
+        <w:rPr>
+          <w:rFonts w:ascii="Consolas" w:hAnsi="Consolas" w:eastAsia="Consolas"/>
+          <w:b w:val="0"/>
+          <w:i w:val="0"/>
+          <w:sz w:val="15"/>
+        </w:rPr>
+        <w:t xml:space="preserve">      - "3000:3000"</w:t>
+      </w:r>
+    </w:p>
+    <w:p>
+      <w:pPr>
+        <w:spacing w:before="80" w:after="160" w:line="322" w:lineRule="auto"/>
+        <w:jc w:val="both"/>
+      </w:pPr>
+      <w:r>
+        <w:rPr>
+          <w:rFonts w:ascii="Calibri" w:hAnsi="Calibri" w:eastAsia="Calibri"/>
+          <w:b w:val="0"/>
+          <w:i w:val="0"/>
+          <w:sz w:val="22"/>
+        </w:rPr>
+        <w:t>The attack target is mounted into both images rather than copied into them. That is deliberate: if only the vulnerable image contained secret.txt, a 404 on the fixed image would prove nothing, because the file might simply be missing. Mounting it in both runs leaves the Node.js version as the only variable.</w:t>
+      </w:r>
+    </w:p>
+    <w:p>
+      <w:pPr>
+        <w:shd w:fill="F4F6FA"/>
+        <w:spacing w:before="0" w:after="0" w:line="200" w:lineRule="exact"/>
+        <w:ind w:left="113" w:right="113"/>
+      </w:pPr>
+      <w:r>
+        <w:rPr>
+          <w:rFonts w:ascii="Consolas" w:hAnsi="Consolas" w:eastAsia="Consolas"/>
+          <w:b w:val="0"/>
+          <w:i w:val="0"/>
+          <w:sz w:val="15"/>
+        </w:rPr>
+        <w:t>$ docker compose up -d --build</w:t>
+      </w:r>
+    </w:p>
+    <w:p>
+      <w:pPr>
+        <w:shd w:fill="F4F6FA"/>
+        <w:spacing w:before="0" w:after="0" w:line="200" w:lineRule="exact"/>
+        <w:ind w:left="113" w:right="113"/>
+      </w:pPr>
+      <w:r>
+        <w:rPr>
+          <w:rFonts w:ascii="Consolas" w:hAnsi="Consolas" w:eastAsia="Consolas"/>
+          <w:b w:val="0"/>
+          <w:i w:val="0"/>
+          <w:sz w:val="15"/>
+        </w:rPr>
+        <w:t>$ docker compose exec node node --version</w:t>
+      </w:r>
+    </w:p>
+    <w:p>
+      <w:pPr>
+        <w:shd w:fill="F4F6FA"/>
+        <w:spacing w:before="0" w:after="0" w:line="200" w:lineRule="exact"/>
+        <w:ind w:left="113" w:right="113"/>
+      </w:pPr>
+      <w:r>
+        <w:rPr>
+          <w:rFonts w:ascii="Consolas" w:hAnsi="Consolas" w:eastAsia="Consolas"/>
+          <w:b w:val="0"/>
+          <w:i w:val="0"/>
+          <w:sz w:val="15"/>
+        </w:rPr>
+        <w:t>v8.5.0</w:t>
+      </w:r>
+    </w:p>
+    <w:p>
+      <w:pPr>
+        <w:shd w:fill="F4F6FA"/>
+        <w:spacing w:before="0" w:after="0" w:line="200" w:lineRule="exact"/>
+        <w:ind w:left="113" w:right="113"/>
+      </w:pPr>
+      <w:r>
+        <w:rPr>
+          <w:rFonts w:ascii="Consolas" w:hAnsi="Consolas" w:eastAsia="Consolas"/>
+          <w:b w:val="0"/>
+          <w:i w:val="0"/>
+          <w:sz w:val="15"/>
+        </w:rPr>
         <w:t xml:space="preserve"> </w:t>
       </w:r>
     </w:p>
@@ -3840,7 +3999,7 @@
           <w:i w:val="0"/>
           <w:sz w:val="15"/>
         </w:rPr>
-        <w:t># path actually executed here</w:t>
+        <w:t>$ curl --path-as-is -s -o /dev/null -w '%{http_code}' \</w:t>
       </w:r>
     </w:p>
     <w:p>
@@ -3856,7 +4015,7 @@
           <w:i w:val="0"/>
           <w:sz w:val="15"/>
         </w:rPr>
-        <w:t>cd cve/CVE-2017-14849 &amp;&amp; npm install          # express 4.15.5</w:t>
+        <w:t xml:space="preserve">       http://127.0.0.1:3000/static/main.js</w:t>
       </w:r>
     </w:p>
     <w:p>
@@ -3872,7 +4031,7 @@
           <w:i w:val="0"/>
           <w:sz w:val="15"/>
         </w:rPr>
-        <w:t>curl -L --ssl-no-revoke -o node8.zip \</w:t>
+        <w:t>200</w:t>
       </w:r>
     </w:p>
     <w:p>
@@ -3888,7 +4047,7 @@
           <w:i w:val="0"/>
           <w:sz w:val="15"/>
         </w:rPr>
-        <w:t xml:space="preserve">  https://registry.npmmirror.com/-/binary/node/v8.5.0/node-v8.5.0-win-x64.zip</w:t>
+        <w:t xml:space="preserve"> </w:t>
       </w:r>
     </w:p>
     <w:p>
@@ -3904,7 +4063,7 @@
           <w:i w:val="0"/>
           <w:sz w:val="15"/>
         </w:rPr>
-        <w:t>tar -xf node8.zip -C C:\n850</w:t>
+        <w:t>$ curl --path-as-is -s 'http://127.0.0.1:3000/static/../foo/../../secret.txt'</w:t>
       </w:r>
     </w:p>
     <w:p>
@@ -3920,23 +4079,7 @@
           <w:i w:val="0"/>
           <w:sz w:val="15"/>
         </w:rPr>
-        <w:t>C:\n850\node-v8.5.0-win-x64\node.exe www/app.js</w:t>
-      </w:r>
-    </w:p>
-    <w:p>
-      <w:pPr>
-        <w:shd w:fill="F4F6FA"/>
-        <w:spacing w:before="0" w:after="0" w:line="200" w:lineRule="exact"/>
-        <w:ind w:left="113" w:right="113"/>
-      </w:pPr>
-      <w:r>
-        <w:rPr>
-          <w:rFonts w:ascii="Consolas" w:hAnsi="Consolas" w:eastAsia="Consolas"/>
-          <w:b w:val="0"/>
-          <w:i w:val="0"/>
-          <w:sz w:val="15"/>
-        </w:rPr>
-        <w:t># Example app listening on port 3000!</w:t>
+        <w:t>SECRET_FLAG{this-file-lives-outside-the-static-root}</w:t>
       </w:r>
     </w:p>
     <w:p>
@@ -3952,7 +4095,197 @@
           <w:color w:val="555555"/>
           <w:sz w:val="18"/>
         </w:rPr>
-        <w:t>Terminal transcript: bringing up the vulnerable target.</w:t>
+        <w:t>Terminal transcript: the traversal succeeds inside the container running Node 8.5.0.</w:t>
+      </w:r>
+    </w:p>
+    <w:p>
+      <w:pPr>
+        <w:spacing w:before="80" w:after="160" w:line="322" w:lineRule="auto"/>
+        <w:jc w:val="both"/>
+      </w:pPr>
+      <w:r>
+        <w:rPr>
+          <w:rFonts w:ascii="Calibri" w:hAnsi="Calibri" w:eastAsia="Calibri"/>
+          <w:b w:val="0"/>
+          <w:i w:val="0"/>
+          <w:sz w:val="22"/>
+        </w:rPr>
+        <w:t>The same request against the fixed image, built from the same application and the same mounted files:</w:t>
+      </w:r>
+    </w:p>
+    <w:p>
+      <w:pPr>
+        <w:shd w:fill="F4F6FA"/>
+        <w:spacing w:before="0" w:after="0" w:line="200" w:lineRule="exact"/>
+        <w:ind w:left="113" w:right="113"/>
+      </w:pPr>
+      <w:r>
+        <w:rPr>
+          <w:rFonts w:ascii="Consolas" w:hAnsi="Consolas" w:eastAsia="Consolas"/>
+          <w:b w:val="0"/>
+          <w:i w:val="0"/>
+          <w:sz w:val="15"/>
+        </w:rPr>
+        <w:t>$ docker compose -f docker-compose.fixed.yml up -d --build</w:t>
+      </w:r>
+    </w:p>
+    <w:p>
+      <w:pPr>
+        <w:shd w:fill="F4F6FA"/>
+        <w:spacing w:before="0" w:after="0" w:line="200" w:lineRule="exact"/>
+        <w:ind w:left="113" w:right="113"/>
+      </w:pPr>
+      <w:r>
+        <w:rPr>
+          <w:rFonts w:ascii="Consolas" w:hAnsi="Consolas" w:eastAsia="Consolas"/>
+          <w:b w:val="0"/>
+          <w:i w:val="0"/>
+          <w:sz w:val="15"/>
+        </w:rPr>
+        <w:t>$ docker compose -f docker-compose.fixed.yml exec node node --version</w:t>
+      </w:r>
+    </w:p>
+    <w:p>
+      <w:pPr>
+        <w:shd w:fill="F4F6FA"/>
+        <w:spacing w:before="0" w:after="0" w:line="200" w:lineRule="exact"/>
+        <w:ind w:left="113" w:right="113"/>
+      </w:pPr>
+      <w:r>
+        <w:rPr>
+          <w:rFonts w:ascii="Consolas" w:hAnsi="Consolas" w:eastAsia="Consolas"/>
+          <w:b w:val="0"/>
+          <w:i w:val="0"/>
+          <w:sz w:val="15"/>
+        </w:rPr>
+        <w:t>v8.6.0</w:t>
+      </w:r>
+    </w:p>
+    <w:p>
+      <w:pPr>
+        <w:shd w:fill="F4F6FA"/>
+        <w:spacing w:before="0" w:after="0" w:line="200" w:lineRule="exact"/>
+        <w:ind w:left="113" w:right="113"/>
+      </w:pPr>
+      <w:r>
+        <w:rPr>
+          <w:rFonts w:ascii="Consolas" w:hAnsi="Consolas" w:eastAsia="Consolas"/>
+          <w:b w:val="0"/>
+          <w:i w:val="0"/>
+          <w:sz w:val="15"/>
+        </w:rPr>
+        <w:t xml:space="preserve"> </w:t>
+      </w:r>
+    </w:p>
+    <w:p>
+      <w:pPr>
+        <w:shd w:fill="F4F6FA"/>
+        <w:spacing w:before="0" w:after="0" w:line="200" w:lineRule="exact"/>
+        <w:ind w:left="113" w:right="113"/>
+      </w:pPr>
+      <w:r>
+        <w:rPr>
+          <w:rFonts w:ascii="Consolas" w:hAnsi="Consolas" w:eastAsia="Consolas"/>
+          <w:b w:val="0"/>
+          <w:i w:val="0"/>
+          <w:sz w:val="15"/>
+        </w:rPr>
+        <w:t>$ curl --path-as-is -s -o /dev/null -w '%{http_code}' \</w:t>
+      </w:r>
+    </w:p>
+    <w:p>
+      <w:pPr>
+        <w:shd w:fill="F4F6FA"/>
+        <w:spacing w:before="0" w:after="0" w:line="200" w:lineRule="exact"/>
+        <w:ind w:left="113" w:right="113"/>
+      </w:pPr>
+      <w:r>
+        <w:rPr>
+          <w:rFonts w:ascii="Consolas" w:hAnsi="Consolas" w:eastAsia="Consolas"/>
+          <w:b w:val="0"/>
+          <w:i w:val="0"/>
+          <w:sz w:val="15"/>
+        </w:rPr>
+        <w:t xml:space="preserve">       http://127.0.0.1:3000/static/../foo/../../secret.txt</w:t>
+      </w:r>
+    </w:p>
+    <w:p>
+      <w:pPr>
+        <w:shd w:fill="F4F6FA"/>
+        <w:spacing w:before="0" w:after="0" w:line="200" w:lineRule="exact"/>
+        <w:ind w:left="113" w:right="113"/>
+      </w:pPr>
+      <w:r>
+        <w:rPr>
+          <w:rFonts w:ascii="Consolas" w:hAnsi="Consolas" w:eastAsia="Consolas"/>
+          <w:b w:val="0"/>
+          <w:i w:val="0"/>
+          <w:sz w:val="15"/>
+        </w:rPr>
+        <w:t>404</w:t>
+      </w:r>
+    </w:p>
+    <w:p>
+      <w:pPr>
+        <w:shd w:fill="F4F6FA"/>
+        <w:spacing w:before="0" w:after="0" w:line="200" w:lineRule="exact"/>
+        <w:ind w:left="113" w:right="113"/>
+      </w:pPr>
+      <w:r>
+        <w:rPr>
+          <w:rFonts w:ascii="Consolas" w:hAnsi="Consolas" w:eastAsia="Consolas"/>
+          <w:b w:val="0"/>
+          <w:i w:val="0"/>
+          <w:sz w:val="15"/>
+        </w:rPr>
+        <w:t>$ curl --path-as-is -s -o /dev/null -w '%{http_code}' http://127.0.0.1:3000/static/main.js</w:t>
+      </w:r>
+    </w:p>
+    <w:p>
+      <w:pPr>
+        <w:shd w:fill="F4F6FA"/>
+        <w:spacing w:before="0" w:after="0" w:line="200" w:lineRule="exact"/>
+        <w:ind w:left="113" w:right="113"/>
+      </w:pPr>
+      <w:r>
+        <w:rPr>
+          <w:rFonts w:ascii="Consolas" w:hAnsi="Consolas" w:eastAsia="Consolas"/>
+          <w:b w:val="0"/>
+          <w:i w:val="0"/>
+          <w:sz w:val="15"/>
+        </w:rPr>
+        <w:t>200</w:t>
+      </w:r>
+    </w:p>
+    <w:p>
+      <w:pPr>
+        <w:spacing w:before="60" w:after="220"/>
+        <w:jc w:val="left"/>
+      </w:pPr>
+      <w:r>
+        <w:rPr>
+          <w:rFonts w:ascii="Calibri" w:hAnsi="Calibri" w:eastAsia="Calibri"/>
+          <w:b w:val="0"/>
+          <w:i w:val="0"/>
+          <w:color w:val="555555"/>
+          <w:sz w:val="18"/>
+        </w:rPr>
+        <w:t>Terminal transcript: identical request, fixed runtime — rejected, and normal requests are still served. Full transcript in evidence/shot-docker and docker-evidence.txt.</w:t>
+      </w:r>
+    </w:p>
+    <w:p>
+      <w:pPr>
+        <w:spacing w:before="80" w:after="160" w:line="322" w:lineRule="auto"/>
+        <w:jc w:val="both"/>
+      </w:pPr>
+      <w:r>
+        <w:rPr>
+          <w:rFonts w:ascii="Calibri" w:hAnsi="Calibri" w:eastAsia="Calibri"/>
+          <w:b w:val="0"/>
+          <w:i w:val="0"/>
+          <w:sz w:val="22"/>
+        </w:rPr>
+        <w:t>Before Docker was available on this machine the same result was obtained natively, by running the official Node.js 8.5.0 build directly; that path is kept in the repository as a fallback because it needs no container runtime at all.</w:t>
       </w:r>
     </w:p>
     <w:p>
@@ -5333,7 +5666,7 @@
           <w:i w:val="0"/>
           <w:sz w:val="22"/>
         </w:rPr>
-        <w:t>The limiting factors of this run are recorded honestly in the README: Docker and git were not available, so the vulnerable environment was reproduced natively with the official Node.js 8.5.0 build, and the repository history has to be created before submission.</w:t>
+        <w:t>Two limitations are worth recording. The first reproduction of this vulnerability was made natively, because Docker was not installed on the machine at that time; it was repeated in Docker afterwards, and both runs give the same result — section 5.3 reports the container run, which is what the manual asks for. The second is that the repository history was created with git only after the working tree was complete, so the commits do not show the development process itself.</w:t>
       </w:r>
     </w:p>
     <w:p>
@@ -12761,87 +13094,23 @@
           <w:i w:val="0"/>
           <w:sz w:val="14"/>
         </w:rPr>
-        <w:t>* **Docker was not installed** on the machine used, so the CVE was reproduced</w:t>
-      </w:r>
-    </w:p>
-    <w:p>
-      <w:pPr>
-        <w:shd w:fill="F4F6FA"/>
-        <w:spacing w:before="0" w:after="0" w:line="188" w:lineRule="exact"/>
-        <w:ind w:left="113" w:right="113"/>
-      </w:pPr>
-      <w:r>
-        <w:rPr>
-          <w:rFonts w:ascii="Consolas" w:hAnsi="Consolas" w:eastAsia="Consolas"/>
-          <w:b w:val="0"/>
-          <w:i w:val="0"/>
-          <w:sz w:val="14"/>
-        </w:rPr>
-        <w:t xml:space="preserve">  natively with the official Node.js 8.5.0 build rather than in the vulhub</w:t>
-      </w:r>
-    </w:p>
-    <w:p>
-      <w:pPr>
-        <w:shd w:fill="F4F6FA"/>
-        <w:spacing w:before="0" w:after="0" w:line="188" w:lineRule="exact"/>
-        <w:ind w:left="113" w:right="113"/>
-      </w:pPr>
-      <w:r>
-        <w:rPr>
-          <w:rFonts w:ascii="Consolas" w:hAnsi="Consolas" w:eastAsia="Consolas"/>
-          <w:b w:val="0"/>
-          <w:i w:val="0"/>
-          <w:sz w:val="14"/>
-        </w:rPr>
-        <w:t xml:space="preserve">  container. The exact `docker compose` commands are given above for when</w:t>
-      </w:r>
-    </w:p>
-    <w:p>
-      <w:pPr>
-        <w:shd w:fill="F4F6FA"/>
-        <w:spacing w:before="0" w:after="0" w:line="188" w:lineRule="exact"/>
-        <w:ind w:left="113" w:right="113"/>
-      </w:pPr>
-      <w:r>
-        <w:rPr>
-          <w:rFonts w:ascii="Consolas" w:hAnsi="Consolas" w:eastAsia="Consolas"/>
-          <w:b w:val="0"/>
-          <w:i w:val="0"/>
-          <w:sz w:val="14"/>
-        </w:rPr>
-        <w:t xml:space="preserve">  Docker is available.</w:t>
-      </w:r>
-    </w:p>
-    <w:p>
-      <w:pPr>
-        <w:shd w:fill="F4F6FA"/>
-        <w:spacing w:before="0" w:after="0" w:line="188" w:lineRule="exact"/>
-        <w:ind w:left="113" w:right="113"/>
-      </w:pPr>
-      <w:r>
-        <w:rPr>
-          <w:rFonts w:ascii="Consolas" w:hAnsi="Consolas" w:eastAsia="Consolas"/>
-          <w:b w:val="0"/>
-          <w:i w:val="0"/>
-          <w:sz w:val="14"/>
-        </w:rPr>
-        <w:t>* **`git` was not installed**, so the repository history was not created here.</w:t>
-      </w:r>
-    </w:p>
-    <w:p>
-      <w:pPr>
-        <w:shd w:fill="F4F6FA"/>
-        <w:spacing w:before="0" w:after="0" w:line="188" w:lineRule="exact"/>
-        <w:ind w:left="113" w:right="113"/>
-      </w:pPr>
-      <w:r>
-        <w:rPr>
-          <w:rFonts w:ascii="Consolas" w:hAnsi="Consolas" w:eastAsia="Consolas"/>
-          <w:b w:val="0"/>
-          <w:i w:val="0"/>
-          <w:sz w:val="14"/>
-        </w:rPr>
-        <w:t xml:space="preserve">  To publish it:</w:t>
+        <w:t>* **Two reproduction paths are provided**, and both give the same result.</w:t>
+      </w:r>
+    </w:p>
+    <w:p>
+      <w:pPr>
+        <w:shd w:fill="F4F6FA"/>
+        <w:spacing w:before="0" w:after="0" w:line="188" w:lineRule="exact"/>
+        <w:ind w:left="113" w:right="113"/>
+      </w:pPr>
+      <w:r>
+        <w:rPr>
+          <w:rFonts w:ascii="Consolas" w:hAnsi="Consolas" w:eastAsia="Consolas"/>
+          <w:b w:val="0"/>
+          <w:i w:val="0"/>
+          <w:sz w:val="14"/>
+        </w:rPr>
+        <w:t xml:space="preserve">  The Docker path is the canonical one and matches the manual:</w:t>
       </w:r>
     </w:p>
     <w:p>
@@ -12889,87 +13158,39 @@
           <w:i w:val="0"/>
           <w:sz w:val="14"/>
         </w:rPr>
-        <w:t xml:space="preserve">  git init</w:t>
-      </w:r>
-    </w:p>
-    <w:p>
-      <w:pPr>
-        <w:shd w:fill="F4F6FA"/>
-        <w:spacing w:before="0" w:after="0" w:line="188" w:lineRule="exact"/>
-        <w:ind w:left="113" w:right="113"/>
-      </w:pPr>
-      <w:r>
-        <w:rPr>
-          <w:rFonts w:ascii="Consolas" w:hAnsi="Consolas" w:eastAsia="Consolas"/>
-          <w:b w:val="0"/>
-          <w:i w:val="0"/>
-          <w:sz w:val="14"/>
-        </w:rPr>
-        <w:t xml:space="preserve">  git add .</w:t>
-      </w:r>
-    </w:p>
-    <w:p>
-      <w:pPr>
-        <w:shd w:fill="F4F6FA"/>
-        <w:spacing w:before="0" w:after="0" w:line="188" w:lineRule="exact"/>
-        <w:ind w:left="113" w:right="113"/>
-      </w:pPr>
-      <w:r>
-        <w:rPr>
-          <w:rFonts w:ascii="Consolas" w:hAnsi="Consolas" w:eastAsia="Consolas"/>
-          <w:b w:val="0"/>
-          <w:i w:val="0"/>
-          <w:sz w:val="14"/>
-        </w:rPr>
-        <w:t xml:space="preserve">  git commit -m "Work 1: secure API, CI/CD pipeline and CVE-2017-14849 analysis"</w:t>
-      </w:r>
-    </w:p>
-    <w:p>
-      <w:pPr>
-        <w:shd w:fill="F4F6FA"/>
-        <w:spacing w:before="0" w:after="0" w:line="188" w:lineRule="exact"/>
-        <w:ind w:left="113" w:right="113"/>
-      </w:pPr>
-      <w:r>
-        <w:rPr>
-          <w:rFonts w:ascii="Consolas" w:hAnsi="Consolas" w:eastAsia="Consolas"/>
-          <w:b w:val="0"/>
-          <w:i w:val="0"/>
-          <w:sz w:val="14"/>
-        </w:rPr>
-        <w:t xml:space="preserve">  git branch -M main</w:t>
-      </w:r>
-    </w:p>
-    <w:p>
-      <w:pPr>
-        <w:shd w:fill="F4F6FA"/>
-        <w:spacing w:before="0" w:after="0" w:line="188" w:lineRule="exact"/>
-        <w:ind w:left="113" w:right="113"/>
-      </w:pPr>
-      <w:r>
-        <w:rPr>
-          <w:rFonts w:ascii="Consolas" w:hAnsi="Consolas" w:eastAsia="Consolas"/>
-          <w:b w:val="0"/>
-          <w:i w:val="0"/>
-          <w:sz w:val="14"/>
-        </w:rPr>
-        <w:t xml:space="preserve">  git remote add origin git@github.com:&lt;user&gt;/&lt;repo&gt;.git</w:t>
-      </w:r>
-    </w:p>
-    <w:p>
-      <w:pPr>
-        <w:shd w:fill="F4F6FA"/>
-        <w:spacing w:before="0" w:after="0" w:line="188" w:lineRule="exact"/>
-        <w:ind w:left="113" w:right="113"/>
-      </w:pPr>
-      <w:r>
-        <w:rPr>
-          <w:rFonts w:ascii="Consolas" w:hAnsi="Consolas" w:eastAsia="Consolas"/>
-          <w:b w:val="0"/>
-          <w:i w:val="0"/>
-          <w:sz w:val="14"/>
-        </w:rPr>
-        <w:t xml:space="preserve">  git push -u origin main</w:t>
+        <w:t xml:space="preserve">  cd cve/CVE-2017-14849</w:t>
+      </w:r>
+    </w:p>
+    <w:p>
+      <w:pPr>
+        <w:shd w:fill="F4F6FA"/>
+        <w:spacing w:before="0" w:after="0" w:line="188" w:lineRule="exact"/>
+        <w:ind w:left="113" w:right="113"/>
+      </w:pPr>
+      <w:r>
+        <w:rPr>
+          <w:rFonts w:ascii="Consolas" w:hAnsi="Consolas" w:eastAsia="Consolas"/>
+          <w:b w:val="0"/>
+          <w:i w:val="0"/>
+          <w:sz w:val="14"/>
+        </w:rPr>
+        <w:t xml:space="preserve">  docker compose up -d --build                       # node:8.5.0, vulnerable</w:t>
+      </w:r>
+    </w:p>
+    <w:p>
+      <w:pPr>
+        <w:shd w:fill="F4F6FA"/>
+        <w:spacing w:before="0" w:after="0" w:line="188" w:lineRule="exact"/>
+        <w:ind w:left="113" w:right="113"/>
+      </w:pPr>
+      <w:r>
+        <w:rPr>
+          <w:rFonts w:ascii="Consolas" w:hAnsi="Consolas" w:eastAsia="Consolas"/>
+          <w:b w:val="0"/>
+          <w:i w:val="0"/>
+          <w:sz w:val="14"/>
+        </w:rPr>
+        <w:t xml:space="preserve">  docker compose -f docker-compose.fixed.yml up -d --build   # node:8.6.0, fixed</w:t>
       </w:r>
     </w:p>
     <w:p>
@@ -12986,6 +13207,214 @@
           <w:sz w:val="14"/>
         </w:rPr>
         <w:t xml:space="preserve">  ```</w:t>
+      </w:r>
+    </w:p>
+    <w:p>
+      <w:pPr>
+        <w:shd w:fill="F4F6FA"/>
+        <w:spacing w:before="0" w:after="0" w:line="188" w:lineRule="exact"/>
+        <w:ind w:left="113" w:right="113"/>
+      </w:pPr>
+      <w:r>
+        <w:rPr>
+          <w:rFonts w:ascii="Consolas" w:hAnsi="Consolas" w:eastAsia="Consolas"/>
+          <w:b w:val="0"/>
+          <w:i w:val="0"/>
+          <w:sz w:val="14"/>
+        </w:rPr>
+        <w:t xml:space="preserve"> </w:t>
+      </w:r>
+    </w:p>
+    <w:p>
+      <w:pPr>
+        <w:shd w:fill="F4F6FA"/>
+        <w:spacing w:before="0" w:after="0" w:line="188" w:lineRule="exact"/>
+        <w:ind w:left="113" w:right="113"/>
+      </w:pPr>
+      <w:r>
+        <w:rPr>
+          <w:rFonts w:ascii="Consolas" w:hAnsi="Consolas" w:eastAsia="Consolas"/>
+          <w:b w:val="0"/>
+          <w:i w:val="0"/>
+          <w:sz w:val="14"/>
+        </w:rPr>
+        <w:t xml:space="preserve">  `verify-docker.ps1` runs both in sequence and writes `docker-evidence.txt`.</w:t>
+      </w:r>
+    </w:p>
+    <w:p>
+      <w:pPr>
+        <w:shd w:fill="F4F6FA"/>
+        <w:spacing w:before="0" w:after="0" w:line="188" w:lineRule="exact"/>
+        <w:ind w:left="113" w:right="113"/>
+      </w:pPr>
+      <w:r>
+        <w:rPr>
+          <w:rFonts w:ascii="Consolas" w:hAnsi="Consolas" w:eastAsia="Consolas"/>
+          <w:b w:val="0"/>
+          <w:i w:val="0"/>
+          <w:sz w:val="14"/>
+        </w:rPr>
+        <w:t xml:space="preserve">  The native path (official Node.js 8.5.0 binary, no container runtime) is kept</w:t>
+      </w:r>
+    </w:p>
+    <w:p>
+      <w:pPr>
+        <w:shd w:fill="F4F6FA"/>
+        <w:spacing w:before="0" w:after="0" w:line="188" w:lineRule="exact"/>
+        <w:ind w:left="113" w:right="113"/>
+      </w:pPr>
+      <w:r>
+        <w:rPr>
+          <w:rFonts w:ascii="Consolas" w:hAnsi="Consolas" w:eastAsia="Consolas"/>
+          <w:b w:val="0"/>
+          <w:i w:val="0"/>
+          <w:sz w:val="14"/>
+        </w:rPr>
+        <w:t xml:space="preserve">  because it needs nothing installed and was the first method used here.</w:t>
+      </w:r>
+    </w:p>
+    <w:p>
+      <w:pPr>
+        <w:shd w:fill="F4F6FA"/>
+        <w:spacing w:before="0" w:after="0" w:line="188" w:lineRule="exact"/>
+        <w:ind w:left="113" w:right="113"/>
+      </w:pPr>
+      <w:r>
+        <w:rPr>
+          <w:rFonts w:ascii="Consolas" w:hAnsi="Consolas" w:eastAsia="Consolas"/>
+          <w:b w:val="0"/>
+          <w:i w:val="0"/>
+          <w:sz w:val="14"/>
+        </w:rPr>
+        <w:t xml:space="preserve"> </w:t>
+      </w:r>
+    </w:p>
+    <w:p>
+      <w:pPr>
+        <w:shd w:fill="F4F6FA"/>
+        <w:spacing w:before="0" w:after="0" w:line="188" w:lineRule="exact"/>
+        <w:ind w:left="113" w:right="113"/>
+      </w:pPr>
+      <w:r>
+        <w:rPr>
+          <w:rFonts w:ascii="Consolas" w:hAnsi="Consolas" w:eastAsia="Consolas"/>
+          <w:b w:val="0"/>
+          <w:i w:val="0"/>
+          <w:sz w:val="14"/>
+        </w:rPr>
+        <w:t>* **The attack target is mounted, not baked into the image.** `secret.txt` is</w:t>
+      </w:r>
+    </w:p>
+    <w:p>
+      <w:pPr>
+        <w:shd w:fill="F4F6FA"/>
+        <w:spacing w:before="0" w:after="0" w:line="188" w:lineRule="exact"/>
+        <w:ind w:left="113" w:right="113"/>
+      </w:pPr>
+      <w:r>
+        <w:rPr>
+          <w:rFonts w:ascii="Consolas" w:hAnsi="Consolas" w:eastAsia="Consolas"/>
+          <w:b w:val="0"/>
+          <w:i w:val="0"/>
+          <w:sz w:val="14"/>
+        </w:rPr>
+        <w:t xml:space="preserve">  bind-mounted at `/usr/src/secret.txt` in *both* compose files. If only the</w:t>
+      </w:r>
+    </w:p>
+    <w:p>
+      <w:pPr>
+        <w:shd w:fill="F4F6FA"/>
+        <w:spacing w:before="0" w:after="0" w:line="188" w:lineRule="exact"/>
+        <w:ind w:left="113" w:right="113"/>
+      </w:pPr>
+      <w:r>
+        <w:rPr>
+          <w:rFonts w:ascii="Consolas" w:hAnsi="Consolas" w:eastAsia="Consolas"/>
+          <w:b w:val="0"/>
+          <w:i w:val="0"/>
+          <w:sz w:val="14"/>
+        </w:rPr>
+        <w:t xml:space="preserve">  vulnerable image contained it, a 404 on the fixed image would prove nothing —</w:t>
+      </w:r>
+    </w:p>
+    <w:p>
+      <w:pPr>
+        <w:shd w:fill="F4F6FA"/>
+        <w:spacing w:before="0" w:after="0" w:line="188" w:lineRule="exact"/>
+        <w:ind w:left="113" w:right="113"/>
+      </w:pPr>
+      <w:r>
+        <w:rPr>
+          <w:rFonts w:ascii="Consolas" w:hAnsi="Consolas" w:eastAsia="Consolas"/>
+          <w:b w:val="0"/>
+          <w:i w:val="0"/>
+          <w:sz w:val="14"/>
+        </w:rPr>
+        <w:t xml:space="preserve">  the file might simply be missing. Mounting it in both leaves the runtime</w:t>
+      </w:r>
+    </w:p>
+    <w:p>
+      <w:pPr>
+        <w:shd w:fill="F4F6FA"/>
+        <w:spacing w:before="0" w:after="0" w:line="188" w:lineRule="exact"/>
+        <w:ind w:left="113" w:right="113"/>
+      </w:pPr>
+      <w:r>
+        <w:rPr>
+          <w:rFonts w:ascii="Consolas" w:hAnsi="Consolas" w:eastAsia="Consolas"/>
+          <w:b w:val="0"/>
+          <w:i w:val="0"/>
+          <w:sz w:val="14"/>
+        </w:rPr>
+        <w:t xml:space="preserve">  version as the only variable.</w:t>
+      </w:r>
+    </w:p>
+    <w:p>
+      <w:pPr>
+        <w:shd w:fill="F4F6FA"/>
+        <w:spacing w:before="0" w:after="0" w:line="188" w:lineRule="exact"/>
+        <w:ind w:left="113" w:right="113"/>
+      </w:pPr>
+      <w:r>
+        <w:rPr>
+          <w:rFonts w:ascii="Consolas" w:hAnsi="Consolas" w:eastAsia="Consolas"/>
+          <w:b w:val="0"/>
+          <w:i w:val="0"/>
+          <w:sz w:val="14"/>
+        </w:rPr>
+        <w:t xml:space="preserve"> </w:t>
+      </w:r>
+    </w:p>
+    <w:p>
+      <w:pPr>
+        <w:shd w:fill="F4F6FA"/>
+        <w:spacing w:before="0" w:after="0" w:line="188" w:lineRule="exact"/>
+        <w:ind w:left="113" w:right="113"/>
+      </w:pPr>
+      <w:r>
+        <w:rPr>
+          <w:rFonts w:ascii="Consolas" w:hAnsi="Consolas" w:eastAsia="Consolas"/>
+          <w:b w:val="0"/>
+          <w:i w:val="0"/>
+          <w:sz w:val="14"/>
+        </w:rPr>
+        <w:t>* **The repository history was created after the working tree was complete**,</w:t>
+      </w:r>
+    </w:p>
+    <w:p>
+      <w:pPr>
+        <w:shd w:fill="F4F6FA"/>
+        <w:spacing w:before="0" w:after="0" w:line="188" w:lineRule="exact"/>
+        <w:ind w:left="113" w:right="113"/>
+      </w:pPr>
+      <w:r>
+        <w:rPr>
+          <w:rFonts w:ascii="Consolas" w:hAnsi="Consolas" w:eastAsia="Consolas"/>
+          <w:b w:val="0"/>
+          <w:i w:val="0"/>
+          <w:sz w:val="14"/>
+        </w:rPr>
+        <w:t xml:space="preserve">  so the commits show the finished state rather than the development process.</w:t>
       </w:r>
     </w:p>
     <w:sectPr>

</xml_diff>

<commit_message>
Report: cite the latest successful pipeline run
</commit_message>
<xml_diff>
--- a/report/Work1-Report.docx
+++ b/report/Work1-Report.docx
@@ -881,7 +881,7 @@
           <w:i w:val="0"/>
           <w:sz w:val="22"/>
         </w:rPr>
-        <w:t>Deliverables. The project is published as a public repository, and the pipeline ran on the first push and completed successfully:</w:t>
+        <w:t>Deliverables. The project is published as a public repository; the pipeline runs on every push and the latest successful run is linked below:</w:t>
       </w:r>
     </w:p>
     <w:tbl>
@@ -1006,7 +1006,7 @@
                 <w:i w:val="0"/>
                 <w:sz w:val="16"/>
               </w:rPr>
-              <w:t>Successful pipeline run (run #1)</w:t>
+              <w:t>Last successful pipeline run</w:t>
             </w:r>
           </w:p>
         </w:tc>
@@ -1026,7 +1026,7 @@
                 <w:i w:val="0"/>
                 <w:sz w:val="16"/>
               </w:rPr>
-              <w:t>https://github.com/killer-4087-2/22320110-HDU-CS4-26-27-1-Information-Security/actions/runs/39233093705</w:t>
+              <w:t>https://github.com/killer-4087-2/22320110-HDU-CS4-26-27-1-Information-Security/actions/runs/40445700675</w:t>
             </w:r>
           </w:p>
         </w:tc>
@@ -3308,7 +3308,7 @@
           <w:color w:val="555555"/>
           <w:sz w:val="18"/>
         </w:rPr>
-        <w:t>Fig. 2  The same workflow on GitHub Actions: run #1 finished with status Success in 13 s. The annotation in the lower part is the SAST finding for src/security.js:78.</w:t>
+        <w:t>Fig. 2  An earlier run of the same workflow: run #1 finished with status Success in 13 s. The annotation in the lower part is the SAST finding for src/security.js:78. The latest run is linked in section 2.1.</w:t>
       </w:r>
     </w:p>
     <w:p>

</xml_diff>

<commit_message>
Report: add requirement-to-section mapping and scanner rationale
</commit_message>
<xml_diff>
--- a/report/Work1-Report.docx
+++ b/report/Work1-Report.docx
@@ -363,6 +363,860 @@
         <w:t>The purpose of this work is to go through the full security lifecycle of a small backend service rather than a single isolated exercise: design an API that resists the OWASP Top 10 patterns, put automated security checks into the delivery pipeline, then take a real, publicly documented vulnerability, reproduce it in a controlled environment, explain why it exists, fix it and prove the fix. The same four skills — build, check, break, repair — are what a security engineer does on a daily basis, and the last two are the ones normally skipped by students.</w:t>
       </w:r>
     </w:p>
+    <w:p>
+      <w:pPr>
+        <w:keepNext/>
+        <w:spacing w:before="200" w:after="80" w:line="288" w:lineRule="auto"/>
+      </w:pPr>
+      <w:r>
+        <w:rPr>
+          <w:rFonts w:ascii="Calibri" w:hAnsi="Calibri" w:eastAsia="Calibri"/>
+          <w:b/>
+          <w:i w:val="0"/>
+          <w:color w:val="1F3864"/>
+          <w:sz w:val="25"/>
+        </w:rPr>
+        <w:t>1.1 Where each requirement is answered</w:t>
+      </w:r>
+    </w:p>
+    <w:p>
+      <w:pPr>
+        <w:spacing w:before="0" w:after="80" w:line="322" w:lineRule="auto"/>
+        <w:jc w:val="both"/>
+      </w:pPr>
+      <w:r>
+        <w:rPr>
+          <w:rFonts w:ascii="Calibri" w:hAnsi="Calibri" w:eastAsia="Calibri"/>
+          <w:b w:val="0"/>
+          <w:i w:val="0"/>
+          <w:sz w:val="22"/>
+        </w:rPr>
+        <w:t>The assignment is a checklist, so this table maps every item to the place where it is answered — in this report, in the repository, or both.</w:t>
+      </w:r>
+    </w:p>
+    <w:tbl>
+      <w:tblPr>
+        <w:tblStyle w:val="TableGrid"/>
+        <w:tblW w:type="auto" w:w="0"/>
+        <w:jc w:val="center"/>
+        <w:tblLook w:firstColumn="1" w:firstRow="1" w:lastColumn="0" w:lastRow="0" w:noHBand="0" w:noVBand="1" w:val="04A0"/>
+      </w:tblPr>
+      <w:tblGrid>
+        <w:gridCol w:w="4592"/>
+        <w:gridCol w:w="4592"/>
+      </w:tblGrid>
+      <w:tr>
+        <w:trPr>
+          <w:cantSplit/>
+          <w:tblHeader w:val="true"/>
+        </w:trPr>
+        <w:tc>
+          <w:tcPr>
+            <w:tcW w:type="dxa" w:w="4762"/>
+          </w:tcPr>
+          <w:p>
+            <w:pPr>
+              <w:spacing w:before="60" w:after="60" w:line="271" w:lineRule="auto"/>
+              <w:jc w:val="center"/>
+            </w:pPr>
+            <w:r>
+              <w:rPr>
+                <w:rFonts w:ascii="Calibri" w:hAnsi="Calibri" w:eastAsia="Calibri"/>
+                <w:b/>
+                <w:i w:val="0"/>
+                <w:sz w:val="16"/>
+              </w:rPr>
+              <w:t>Requirement (manual)</w:t>
+            </w:r>
+          </w:p>
+        </w:tc>
+        <w:tc>
+          <w:tcPr>
+            <w:tcW w:type="dxa" w:w="4082"/>
+          </w:tcPr>
+          <w:p>
+            <w:pPr>
+              <w:spacing w:before="60" w:after="60" w:line="271" w:lineRule="auto"/>
+              <w:jc w:val="center"/>
+            </w:pPr>
+            <w:r>
+              <w:rPr>
+                <w:rFonts w:ascii="Calibri" w:hAnsi="Calibri" w:eastAsia="Calibri"/>
+                <w:b/>
+                <w:i w:val="0"/>
+                <w:sz w:val="16"/>
+              </w:rPr>
+              <w:t>Where it is answered</w:t>
+            </w:r>
+          </w:p>
+        </w:tc>
+      </w:tr>
+      <w:tr>
+        <w:trPr>
+          <w:cantSplit/>
+        </w:trPr>
+        <w:tc>
+          <w:tcPr>
+            <w:tcW w:type="dxa" w:w="4762"/>
+          </w:tcPr>
+          <w:p>
+            <w:pPr>
+              <w:spacing w:before="60" w:after="60" w:line="271" w:lineRule="auto"/>
+              <w:jc w:val="left"/>
+            </w:pPr>
+            <w:r>
+              <w:rPr>
+                <w:rFonts w:ascii="Calibri" w:hAnsi="Calibri" w:eastAsia="Calibri"/>
+                <w:b w:val="0"/>
+                <w:i w:val="0"/>
+                <w:sz w:val="16"/>
+              </w:rPr>
+              <w:t>1. Stack, project, git repository linked to a remote</w:t>
+            </w:r>
+          </w:p>
+        </w:tc>
+        <w:tc>
+          <w:tcPr>
+            <w:tcW w:type="dxa" w:w="4082"/>
+          </w:tcPr>
+          <w:p>
+            <w:pPr>
+              <w:spacing w:before="60" w:after="60" w:line="271" w:lineRule="auto"/>
+              <w:jc w:val="left"/>
+            </w:pPr>
+            <w:r>
+              <w:rPr>
+                <w:rFonts w:ascii="Calibri" w:hAnsi="Calibri" w:eastAsia="Calibri"/>
+                <w:b w:val="0"/>
+                <w:i w:val="0"/>
+                <w:sz w:val="16"/>
+              </w:rPr>
+              <w:t>§2.1; repository URL in §2.1 and in the README</w:t>
+            </w:r>
+          </w:p>
+        </w:tc>
+      </w:tr>
+      <w:tr>
+        <w:trPr>
+          <w:cantSplit/>
+        </w:trPr>
+        <w:tc>
+          <w:tcPr>
+            <w:tcW w:type="dxa" w:w="4762"/>
+          </w:tcPr>
+          <w:p>
+            <w:pPr>
+              <w:spacing w:before="60" w:after="60" w:line="271" w:lineRule="auto"/>
+              <w:jc w:val="left"/>
+            </w:pPr>
+            <w:r>
+              <w:rPr>
+                <w:rFonts w:ascii="Calibri" w:hAnsi="Calibri" w:eastAsia="Calibri"/>
+                <w:b w:val="0"/>
+                <w:i w:val="0"/>
+                <w:sz w:val="16"/>
+              </w:rPr>
+              <w:t>2. Functional API — POST /auth/login, GET /api/data, one endpoint of your own</w:t>
+            </w:r>
+          </w:p>
+        </w:tc>
+        <w:tc>
+          <w:tcPr>
+            <w:tcW w:type="dxa" w:w="4082"/>
+          </w:tcPr>
+          <w:p>
+            <w:pPr>
+              <w:spacing w:before="60" w:after="60" w:line="271" w:lineRule="auto"/>
+              <w:jc w:val="left"/>
+            </w:pPr>
+            <w:r>
+              <w:rPr>
+                <w:rFonts w:ascii="Calibri" w:hAnsi="Calibri" w:eastAsia="Calibri"/>
+                <w:b w:val="0"/>
+                <w:i w:val="0"/>
+                <w:sz w:val="16"/>
+              </w:rPr>
+              <w:t>§2.2 (three required plus two extra), tested by 14 automated checks</w:t>
+            </w:r>
+          </w:p>
+        </w:tc>
+      </w:tr>
+      <w:tr>
+        <w:trPr>
+          <w:cantSplit/>
+        </w:trPr>
+        <w:tc>
+          <w:tcPr>
+            <w:tcW w:type="dxa" w:w="4762"/>
+          </w:tcPr>
+          <w:p>
+            <w:pPr>
+              <w:spacing w:before="60" w:after="60" w:line="271" w:lineRule="auto"/>
+              <w:jc w:val="left"/>
+            </w:pPr>
+            <w:r>
+              <w:rPr>
+                <w:rFonts w:ascii="Calibri" w:hAnsi="Calibri" w:eastAsia="Calibri"/>
+                <w:b w:val="0"/>
+                <w:i w:val="0"/>
+                <w:sz w:val="16"/>
+              </w:rPr>
+              <w:t>2. Data storage (SQLite or similar)</w:t>
+            </w:r>
+          </w:p>
+        </w:tc>
+        <w:tc>
+          <w:tcPr>
+            <w:tcW w:type="dxa" w:w="4082"/>
+          </w:tcPr>
+          <w:p>
+            <w:pPr>
+              <w:spacing w:before="60" w:after="60" w:line="271" w:lineRule="auto"/>
+              <w:jc w:val="left"/>
+            </w:pPr>
+            <w:r>
+              <w:rPr>
+                <w:rFonts w:ascii="Calibri" w:hAnsi="Calibri" w:eastAsia="Calibri"/>
+                <w:b w:val="0"/>
+                <w:i w:val="0"/>
+                <w:sz w:val="16"/>
+              </w:rPr>
+              <w:t>§2.1 — SQLite through the built-in node:sqlite</w:t>
+            </w:r>
+          </w:p>
+        </w:tc>
+      </w:tr>
+      <w:tr>
+        <w:trPr>
+          <w:cantSplit/>
+        </w:trPr>
+        <w:tc>
+          <w:tcPr>
+            <w:tcW w:type="dxa" w:w="4762"/>
+          </w:tcPr>
+          <w:p>
+            <w:pPr>
+              <w:spacing w:before="60" w:after="60" w:line="271" w:lineRule="auto"/>
+              <w:jc w:val="left"/>
+            </w:pPr>
+            <w:r>
+              <w:rPr>
+                <w:rFonts w:ascii="Calibri" w:hAnsi="Calibri" w:eastAsia="Calibri"/>
+                <w:b w:val="0"/>
+                <w:i w:val="0"/>
+                <w:sz w:val="16"/>
+              </w:rPr>
+              <w:t>3. SQLi protection — prepared statements, no concatenation</w:t>
+            </w:r>
+          </w:p>
+        </w:tc>
+        <w:tc>
+          <w:tcPr>
+            <w:tcW w:type="dxa" w:w="4082"/>
+          </w:tcPr>
+          <w:p>
+            <w:pPr>
+              <w:spacing w:before="60" w:after="60" w:line="271" w:lineRule="auto"/>
+              <w:jc w:val="left"/>
+            </w:pPr>
+            <w:r>
+              <w:rPr>
+                <w:rFonts w:ascii="Calibri" w:hAnsi="Calibri" w:eastAsia="Calibri"/>
+                <w:b w:val="0"/>
+                <w:i w:val="0"/>
+                <w:sz w:val="16"/>
+              </w:rPr>
+              <w:t>§3.1 with the statement from src/db.js</w:t>
+            </w:r>
+          </w:p>
+        </w:tc>
+      </w:tr>
+      <w:tr>
+        <w:trPr>
+          <w:cantSplit/>
+        </w:trPr>
+        <w:tc>
+          <w:tcPr>
+            <w:tcW w:type="dxa" w:w="4762"/>
+          </w:tcPr>
+          <w:p>
+            <w:pPr>
+              <w:spacing w:before="60" w:after="60" w:line="271" w:lineRule="auto"/>
+              <w:jc w:val="left"/>
+            </w:pPr>
+            <w:r>
+              <w:rPr>
+                <w:rFonts w:ascii="Calibri" w:hAnsi="Calibri" w:eastAsia="Calibri"/>
+                <w:b w:val="0"/>
+                <w:i w:val="0"/>
+                <w:sz w:val="16"/>
+              </w:rPr>
+              <w:t>3. XSS protection — escape all user data returned in responses</w:t>
+            </w:r>
+          </w:p>
+        </w:tc>
+        <w:tc>
+          <w:tcPr>
+            <w:tcW w:type="dxa" w:w="4082"/>
+          </w:tcPr>
+          <w:p>
+            <w:pPr>
+              <w:spacing w:before="60" w:after="60" w:line="271" w:lineRule="auto"/>
+              <w:jc w:val="left"/>
+            </w:pPr>
+            <w:r>
+              <w:rPr>
+                <w:rFonts w:ascii="Calibri" w:hAnsi="Calibri" w:eastAsia="Calibri"/>
+                <w:b w:val="0"/>
+                <w:i w:val="0"/>
+                <w:sz w:val="16"/>
+              </w:rPr>
+              <w:t>§3.2 with the encoder from src/security.js</w:t>
+            </w:r>
+          </w:p>
+        </w:tc>
+      </w:tr>
+      <w:tr>
+        <w:trPr>
+          <w:cantSplit/>
+        </w:trPr>
+        <w:tc>
+          <w:tcPr>
+            <w:tcW w:type="dxa" w:w="4762"/>
+          </w:tcPr>
+          <w:p>
+            <w:pPr>
+              <w:spacing w:before="60" w:after="60" w:line="271" w:lineRule="auto"/>
+              <w:jc w:val="left"/>
+            </w:pPr>
+            <w:r>
+              <w:rPr>
+                <w:rFonts w:ascii="Calibri" w:hAnsi="Calibri" w:eastAsia="Calibri"/>
+                <w:b w:val="0"/>
+                <w:i w:val="0"/>
+                <w:sz w:val="16"/>
+              </w:rPr>
+              <w:t>3. Broken authentication — JWT issuance, verification middleware, bcrypt</w:t>
+            </w:r>
+          </w:p>
+        </w:tc>
+        <w:tc>
+          <w:tcPr>
+            <w:tcW w:type="dxa" w:w="4082"/>
+          </w:tcPr>
+          <w:p>
+            <w:pPr>
+              <w:spacing w:before="60" w:after="60" w:line="271" w:lineRule="auto"/>
+              <w:jc w:val="left"/>
+            </w:pPr>
+            <w:r>
+              <w:rPr>
+                <w:rFonts w:ascii="Calibri" w:hAnsi="Calibri" w:eastAsia="Calibri"/>
+                <w:b w:val="0"/>
+                <w:i w:val="0"/>
+                <w:sz w:val="16"/>
+              </w:rPr>
+              <w:t>§3.3, covering issuing, verification, hashing, timing and lockout</w:t>
+            </w:r>
+          </w:p>
+        </w:tc>
+      </w:tr>
+      <w:tr>
+        <w:trPr>
+          <w:cantSplit/>
+        </w:trPr>
+        <w:tc>
+          <w:tcPr>
+            <w:tcW w:type="dxa" w:w="4762"/>
+          </w:tcPr>
+          <w:p>
+            <w:pPr>
+              <w:spacing w:before="60" w:after="60" w:line="271" w:lineRule="auto"/>
+              <w:jc w:val="left"/>
+            </w:pPr>
+            <w:r>
+              <w:rPr>
+                <w:rFonts w:ascii="Calibri" w:hAnsi="Calibri" w:eastAsia="Calibri"/>
+                <w:b w:val="0"/>
+                <w:i w:val="0"/>
+                <w:sz w:val="16"/>
+              </w:rPr>
+              <w:t>4. CI/CD file in .github/workflows, SAST and SCA on every push</w:t>
+            </w:r>
+          </w:p>
+        </w:tc>
+        <w:tc>
+          <w:tcPr>
+            <w:tcW w:type="dxa" w:w="4082"/>
+          </w:tcPr>
+          <w:p>
+            <w:pPr>
+              <w:spacing w:before="60" w:after="60" w:line="271" w:lineRule="auto"/>
+              <w:jc w:val="left"/>
+            </w:pPr>
+            <w:r>
+              <w:rPr>
+                <w:rFonts w:ascii="Calibri" w:hAnsi="Calibri" w:eastAsia="Calibri"/>
+                <w:b w:val="0"/>
+                <w:i w:val="0"/>
+                <w:sz w:val="16"/>
+              </w:rPr>
+              <w:t>§4 with the workflow file and the stage table</w:t>
+            </w:r>
+          </w:p>
+        </w:tc>
+      </w:tr>
+      <w:tr>
+        <w:trPr>
+          <w:cantSplit/>
+        </w:trPr>
+        <w:tc>
+          <w:tcPr>
+            <w:tcW w:type="dxa" w:w="4762"/>
+          </w:tcPr>
+          <w:p>
+            <w:pPr>
+              <w:spacing w:before="60" w:after="60" w:line="271" w:lineRule="auto"/>
+              <w:jc w:val="left"/>
+            </w:pPr>
+            <w:r>
+              <w:rPr>
+                <w:rFonts w:ascii="Calibri" w:hAnsi="Calibri" w:eastAsia="Calibri"/>
+                <w:b w:val="0"/>
+                <w:i w:val="0"/>
+                <w:sz w:val="16"/>
+              </w:rPr>
+              <w:t>5. Test the API with curl; screenshots of SAST/SCA results</w:t>
+            </w:r>
+          </w:p>
+        </w:tc>
+        <w:tc>
+          <w:tcPr>
+            <w:tcW w:type="dxa" w:w="4082"/>
+          </w:tcPr>
+          <w:p>
+            <w:pPr>
+              <w:spacing w:before="60" w:after="60" w:line="271" w:lineRule="auto"/>
+              <w:jc w:val="left"/>
+            </w:pPr>
+            <w:r>
+              <w:rPr>
+                <w:rFonts w:ascii="Calibri" w:hAnsi="Calibri" w:eastAsia="Calibri"/>
+                <w:b w:val="0"/>
+                <w:i w:val="0"/>
+                <w:sz w:val="16"/>
+              </w:rPr>
+              <w:t>§2.2 (curl examples) and §4, Fig. 1 and Fig. 2 taken from the Actions section</w:t>
+            </w:r>
+          </w:p>
+        </w:tc>
+      </w:tr>
+      <w:tr>
+        <w:trPr>
+          <w:cantSplit/>
+        </w:trPr>
+        <w:tc>
+          <w:tcPr>
+            <w:tcW w:type="dxa" w:w="4762"/>
+          </w:tcPr>
+          <w:p>
+            <w:pPr>
+              <w:spacing w:before="60" w:after="60" w:line="271" w:lineRule="auto"/>
+              <w:jc w:val="left"/>
+            </w:pPr>
+            <w:r>
+              <w:rPr>
+                <w:rFonts w:ascii="Calibri" w:hAnsi="Calibri" w:eastAsia="Calibri"/>
+                <w:b w:val="0"/>
+                <w:i w:val="0"/>
+                <w:sz w:val="16"/>
+              </w:rPr>
+              <w:t>6–7. Vulnerable environment from Vulhub, Docker, service started</w:t>
+            </w:r>
+          </w:p>
+        </w:tc>
+        <w:tc>
+          <w:tcPr>
+            <w:tcW w:type="dxa" w:w="4082"/>
+          </w:tcPr>
+          <w:p>
+            <w:pPr>
+              <w:spacing w:before="60" w:after="60" w:line="271" w:lineRule="auto"/>
+              <w:jc w:val="left"/>
+            </w:pPr>
+            <w:r>
+              <w:rPr>
+                <w:rFonts w:ascii="Calibri" w:hAnsi="Calibri" w:eastAsia="Calibri"/>
+                <w:b w:val="0"/>
+                <w:i w:val="0"/>
+                <w:sz w:val="16"/>
+              </w:rPr>
+              <w:t>§5.3 — docker compose build/up, verified inside the container</w:t>
+            </w:r>
+          </w:p>
+        </w:tc>
+      </w:tr>
+      <w:tr>
+        <w:trPr>
+          <w:cantSplit/>
+        </w:trPr>
+        <w:tc>
+          <w:tcPr>
+            <w:tcW w:type="dxa" w:w="4762"/>
+          </w:tcPr>
+          <w:p>
+            <w:pPr>
+              <w:spacing w:before="60" w:after="60" w:line="271" w:lineRule="auto"/>
+              <w:jc w:val="left"/>
+            </w:pPr>
+            <w:r>
+              <w:rPr>
+                <w:rFonts w:ascii="Calibri" w:hAnsi="Calibri" w:eastAsia="Calibri"/>
+                <w:b w:val="0"/>
+                <w:i w:val="0"/>
+                <w:sz w:val="16"/>
+              </w:rPr>
+              <w:t>8. Reproduce the attack, record every command and request</w:t>
+            </w:r>
+          </w:p>
+        </w:tc>
+        <w:tc>
+          <w:tcPr>
+            <w:tcW w:type="dxa" w:w="4082"/>
+          </w:tcPr>
+          <w:p>
+            <w:pPr>
+              <w:spacing w:before="60" w:after="60" w:line="271" w:lineRule="auto"/>
+              <w:jc w:val="left"/>
+            </w:pPr>
+            <w:r>
+              <w:rPr>
+                <w:rFonts w:ascii="Calibri" w:hAnsi="Calibri" w:eastAsia="Calibri"/>
+                <w:b w:val="0"/>
+                <w:i w:val="0"/>
+                <w:sz w:val="16"/>
+              </w:rPr>
+              <w:t>§5.3, plus evidence/ transcripts</w:t>
+            </w:r>
+          </w:p>
+        </w:tc>
+      </w:tr>
+      <w:tr>
+        <w:trPr>
+          <w:cantSplit/>
+        </w:trPr>
+        <w:tc>
+          <w:tcPr>
+            <w:tcW w:type="dxa" w:w="4762"/>
+          </w:tcPr>
+          <w:p>
+            <w:pPr>
+              <w:spacing w:before="60" w:after="60" w:line="271" w:lineRule="auto"/>
+              <w:jc w:val="left"/>
+            </w:pPr>
+            <w:r>
+              <w:rPr>
+                <w:rFonts w:ascii="Calibri" w:hAnsi="Calibri" w:eastAsia="Calibri"/>
+                <w:b w:val="0"/>
+                <w:i w:val="0"/>
+                <w:sz w:val="16"/>
+              </w:rPr>
+              <w:t>9. Root cause analysis in your own words</w:t>
+            </w:r>
+          </w:p>
+        </w:tc>
+        <w:tc>
+          <w:tcPr>
+            <w:tcW w:type="dxa" w:w="4082"/>
+          </w:tcPr>
+          <w:p>
+            <w:pPr>
+              <w:spacing w:before="60" w:after="60" w:line="271" w:lineRule="auto"/>
+              <w:jc w:val="left"/>
+            </w:pPr>
+            <w:r>
+              <w:rPr>
+                <w:rFonts w:ascii="Calibri" w:hAnsi="Calibri" w:eastAsia="Calibri"/>
+                <w:b w:val="0"/>
+                <w:i w:val="0"/>
+                <w:sz w:val="16"/>
+              </w:rPr>
+              <w:t>§5.4 — the normalize() logic error</w:t>
+            </w:r>
+          </w:p>
+        </w:tc>
+      </w:tr>
+      <w:tr>
+        <w:trPr>
+          <w:cantSplit/>
+        </w:trPr>
+        <w:tc>
+          <w:tcPr>
+            <w:tcW w:type="dxa" w:w="4762"/>
+          </w:tcPr>
+          <w:p>
+            <w:pPr>
+              <w:spacing w:before="60" w:after="60" w:line="271" w:lineRule="auto"/>
+              <w:jc w:val="left"/>
+            </w:pPr>
+            <w:r>
+              <w:rPr>
+                <w:rFonts w:ascii="Calibri" w:hAnsi="Calibri" w:eastAsia="Calibri"/>
+                <w:b w:val="0"/>
+                <w:i w:val="0"/>
+                <w:sz w:val="16"/>
+              </w:rPr>
+              <w:t>10. Fix, rebuild, verify the attack no longer works, regression test</w:t>
+            </w:r>
+          </w:p>
+        </w:tc>
+        <w:tc>
+          <w:tcPr>
+            <w:tcW w:type="dxa" w:w="4082"/>
+          </w:tcPr>
+          <w:p>
+            <w:pPr>
+              <w:spacing w:before="60" w:after="60" w:line="271" w:lineRule="auto"/>
+              <w:jc w:val="left"/>
+            </w:pPr>
+            <w:r>
+              <w:rPr>
+                <w:rFonts w:ascii="Calibri" w:hAnsi="Calibri" w:eastAsia="Calibri"/>
+                <w:b w:val="0"/>
+                <w:i w:val="0"/>
+                <w:sz w:val="16"/>
+              </w:rPr>
+              <w:t>§5.5 (fix) and §5.6 (verification and regression)</w:t>
+            </w:r>
+          </w:p>
+        </w:tc>
+      </w:tr>
+      <w:tr>
+        <w:trPr>
+          <w:cantSplit/>
+        </w:trPr>
+        <w:tc>
+          <w:tcPr>
+            <w:tcW w:type="dxa" w:w="4762"/>
+          </w:tcPr>
+          <w:p>
+            <w:pPr>
+              <w:spacing w:before="60" w:after="60" w:line="271" w:lineRule="auto"/>
+              <w:jc w:val="left"/>
+            </w:pPr>
+            <w:r>
+              <w:rPr>
+                <w:rFonts w:ascii="Calibri" w:hAnsi="Calibri" w:eastAsia="Calibri"/>
+                <w:b w:val="0"/>
+                <w:i w:val="0"/>
+                <w:sz w:val="16"/>
+              </w:rPr>
+              <w:t>Submission 1 — public repository link</w:t>
+            </w:r>
+          </w:p>
+        </w:tc>
+        <w:tc>
+          <w:tcPr>
+            <w:tcW w:type="dxa" w:w="4082"/>
+          </w:tcPr>
+          <w:p>
+            <w:pPr>
+              <w:spacing w:before="60" w:after="60" w:line="271" w:lineRule="auto"/>
+              <w:jc w:val="left"/>
+            </w:pPr>
+            <w:r>
+              <w:rPr>
+                <w:rFonts w:ascii="Calibri" w:hAnsi="Calibri" w:eastAsia="Calibri"/>
+                <w:b w:val="0"/>
+                <w:i w:val="0"/>
+                <w:sz w:val="16"/>
+              </w:rPr>
+              <w:t>§2.1</w:t>
+            </w:r>
+          </w:p>
+        </w:tc>
+      </w:tr>
+      <w:tr>
+        <w:trPr>
+          <w:cantSplit/>
+        </w:trPr>
+        <w:tc>
+          <w:tcPr>
+            <w:tcW w:type="dxa" w:w="4762"/>
+          </w:tcPr>
+          <w:p>
+            <w:pPr>
+              <w:spacing w:before="60" w:after="60" w:line="271" w:lineRule="auto"/>
+              <w:jc w:val="left"/>
+            </w:pPr>
+            <w:r>
+              <w:rPr>
+                <w:rFonts w:ascii="Calibri" w:hAnsi="Calibri" w:eastAsia="Calibri"/>
+                <w:b w:val="0"/>
+                <w:i w:val="0"/>
+                <w:sz w:val="16"/>
+              </w:rPr>
+              <w:t>Submission 2 — README text with all eight items</w:t>
+            </w:r>
+          </w:p>
+        </w:tc>
+        <w:tc>
+          <w:tcPr>
+            <w:tcW w:type="dxa" w:w="4082"/>
+          </w:tcPr>
+          <w:p>
+            <w:pPr>
+              <w:spacing w:before="60" w:after="60" w:line="271" w:lineRule="auto"/>
+              <w:jc w:val="left"/>
+            </w:pPr>
+            <w:r>
+              <w:rPr>
+                <w:rFonts w:ascii="Calibri" w:hAnsi="Calibri" w:eastAsia="Calibri"/>
+                <w:b w:val="0"/>
+                <w:i w:val="0"/>
+                <w:sz w:val="16"/>
+              </w:rPr>
+              <w:t>Appendix A reproduces README.md verbatim</w:t>
+            </w:r>
+          </w:p>
+        </w:tc>
+      </w:tr>
+      <w:tr>
+        <w:trPr>
+          <w:cantSplit/>
+        </w:trPr>
+        <w:tc>
+          <w:tcPr>
+            <w:tcW w:type="dxa" w:w="4762"/>
+          </w:tcPr>
+          <w:p>
+            <w:pPr>
+              <w:spacing w:before="60" w:after="60" w:line="271" w:lineRule="auto"/>
+              <w:jc w:val="left"/>
+            </w:pPr>
+            <w:r>
+              <w:rPr>
+                <w:rFonts w:ascii="Calibri" w:hAnsi="Calibri" w:eastAsia="Calibri"/>
+                <w:b w:val="0"/>
+                <w:i w:val="0"/>
+                <w:sz w:val="16"/>
+              </w:rPr>
+              <w:t>Submission 3 — link to the last successful pipeline run</w:t>
+            </w:r>
+          </w:p>
+        </w:tc>
+        <w:tc>
+          <w:tcPr>
+            <w:tcW w:type="dxa" w:w="4082"/>
+          </w:tcPr>
+          <w:p>
+            <w:pPr>
+              <w:spacing w:before="60" w:after="60" w:line="271" w:lineRule="auto"/>
+              <w:jc w:val="left"/>
+            </w:pPr>
+            <w:r>
+              <w:rPr>
+                <w:rFonts w:ascii="Calibri" w:hAnsi="Calibri" w:eastAsia="Calibri"/>
+                <w:b w:val="0"/>
+                <w:i w:val="0"/>
+                <w:sz w:val="16"/>
+              </w:rPr>
+              <w:t>§2.1</w:t>
+            </w:r>
+          </w:p>
+        </w:tc>
+      </w:tr>
+      <w:tr>
+        <w:trPr>
+          <w:cantSplit/>
+        </w:trPr>
+        <w:tc>
+          <w:tcPr>
+            <w:tcW w:type="dxa" w:w="4762"/>
+          </w:tcPr>
+          <w:p>
+            <w:pPr>
+              <w:spacing w:before="60" w:after="60" w:line="271" w:lineRule="auto"/>
+              <w:jc w:val="left"/>
+            </w:pPr>
+            <w:r>
+              <w:rPr>
+                <w:rFonts w:ascii="Calibri" w:hAnsi="Calibri" w:eastAsia="Calibri"/>
+                <w:b w:val="0"/>
+                <w:i w:val="0"/>
+                <w:sz w:val="16"/>
+              </w:rPr>
+              <w:t>Submission 4 — folder with the changed files</w:t>
+            </w:r>
+          </w:p>
+        </w:tc>
+        <w:tc>
+          <w:tcPr>
+            <w:tcW w:type="dxa" w:w="4082"/>
+          </w:tcPr>
+          <w:p>
+            <w:pPr>
+              <w:spacing w:before="60" w:after="60" w:line="271" w:lineRule="auto"/>
+              <w:jc w:val="left"/>
+            </w:pPr>
+            <w:r>
+              <w:rPr>
+                <w:rFonts w:ascii="Calibri" w:hAnsi="Calibri" w:eastAsia="Calibri"/>
+                <w:b w:val="0"/>
+                <w:i w:val="0"/>
+                <w:sz w:val="16"/>
+              </w:rPr>
+              <w:t>fixes/ (Dockerfiles, compose file, notes) and cve/CVE-2017-14849/Dockerfile.fixed</w:t>
+            </w:r>
+          </w:p>
+        </w:tc>
+      </w:tr>
+      <w:tr>
+        <w:trPr>
+          <w:cantSplit/>
+        </w:trPr>
+        <w:tc>
+          <w:tcPr>
+            <w:tcW w:type="dxa" w:w="4762"/>
+          </w:tcPr>
+          <w:p>
+            <w:pPr>
+              <w:spacing w:before="60" w:after="60" w:line="271" w:lineRule="auto"/>
+              <w:jc w:val="left"/>
+            </w:pPr>
+            <w:r>
+              <w:rPr>
+                <w:rFonts w:ascii="Calibri" w:hAnsi="Calibri" w:eastAsia="Calibri"/>
+                <w:b w:val="0"/>
+                <w:i w:val="0"/>
+                <w:sz w:val="16"/>
+              </w:rPr>
+              <w:t>Title page — work number and title, variant, name, HDU number</w:t>
+            </w:r>
+          </w:p>
+        </w:tc>
+        <w:tc>
+          <w:tcPr>
+            <w:tcW w:type="dxa" w:w="4082"/>
+          </w:tcPr>
+          <w:p>
+            <w:pPr>
+              <w:spacing w:before="60" w:after="60" w:line="271" w:lineRule="auto"/>
+              <w:jc w:val="left"/>
+            </w:pPr>
+            <w:r>
+              <w:rPr>
+                <w:rFonts w:ascii="Calibri" w:hAnsi="Calibri" w:eastAsia="Calibri"/>
+                <w:b w:val="0"/>
+                <w:i w:val="0"/>
+                <w:sz w:val="16"/>
+              </w:rPr>
+              <w:t>Title page</w:t>
+            </w:r>
+          </w:p>
+        </w:tc>
+      </w:tr>
+    </w:tbl>
     <w:p>
       <w:pPr>
         <w:keepNext/>
@@ -3083,6 +3937,21 @@
     </w:tbl>
     <w:p>
       <w:pPr>
+        <w:spacing w:before="120" w:after="160" w:line="322" w:lineRule="auto"/>
+        <w:jc w:val="both"/>
+      </w:pPr>
+      <w:r>
+        <w:rPr>
+          <w:rFonts w:ascii="Calibri" w:hAnsi="Calibri" w:eastAsia="Calibri"/>
+          <w:b w:val="0"/>
+          <w:i w:val="0"/>
+          <w:sz w:val="22"/>
+        </w:rPr>
+        <w:t>**On the choice of scanners.** The manual suggests `npm audit` or `snyk test` for JavaScript under SAST, and OWASP Dependency-Check or Snyk under SCA. The split is slightly unusual, because `npm audit` is a composition analysis tool: it compares the installed dependency tree against advisory data and never reads the project's own code. This repository therefore uses **ESLint with eslint-plugin-security for SAST** — it inspects our source, which is what static analysis means — and **npm audit for SCA**, which queries the npm advisory database, the same corpus that Dependency-Check consults for JavaScript packages. Both are free, need no account or API key, and run in the pipeline on every push, which satisfies the grading criterion of at least one SAST/SCA tool running in CI.</w:t>
+      </w:r>
+    </w:p>
+    <w:p>
+      <w:pPr>
         <w:spacing w:before="0" w:after="80" w:line="322" w:lineRule="auto"/>
       </w:pPr>
     </w:p>
@@ -4096,6 +4965,21 @@
           <w:sz w:val="18"/>
         </w:rPr>
         <w:t>Terminal transcript: the traversal succeeds inside the container running Node 8.5.0.</w:t>
+      </w:r>
+    </w:p>
+    <w:p>
+      <w:pPr>
+        <w:spacing w:before="80" w:after="160" w:line="322" w:lineRule="auto"/>
+        <w:jc w:val="both"/>
+      </w:pPr>
+      <w:r>
+        <w:rPr>
+          <w:rFonts w:ascii="Calibri" w:hAnsi="Calibri" w:eastAsia="Calibri"/>
+          <w:b w:val="0"/>
+          <w:i w:val="0"/>
+          <w:sz w:val="22"/>
+        </w:rPr>
+        <w:t>Both runs were executed by `cve/CVE-2017-14849/verify-docker.ps1`, which builds each image, waits until the application actually answers HTTP 200, issues the requests and writes the whole session to `cve/CVE-2017-14849/docker-evidence.txt` in the repository. That transcript is the raw evidence; the figures below show the same requests against the same application on the native runtime, where a window capture was possible.</w:t>
       </w:r>
     </w:p>
     <w:p>

</xml_diff>

<commit_message>
Report: correct two control-question answers (Docker now used; precise SAST/DAST wording)
</commit_message>
<xml_diff>
--- a/report/Work1-Report.docx
+++ b/report/Work1-Report.docx
@@ -6309,7 +6309,7 @@
           <w:i w:val="0"/>
           <w:sz w:val="20"/>
         </w:rPr>
-        <w:t>SAST analyses source code without running it, so it sees every branch including code that never executes, but it cannot tell whether a finding is reachable from an entry point and therefore produces false positives. DAST attacks a running application from the outside and reports only vulnerabilities that are actually exploitable, but it can only see what it manages to reach and gives no line number. This work uses SAST in the pipeline and relies on the CVE reproduction for the dynamic side.</w:t>
+        <w:t>SAST analyses source code without running it, so it sees every branch including code that never executes, but it cannot tell whether a finding is reachable from an entry point and therefore produces false positives. DAST attacks a running application from the outside and reports only vulnerabilities that are actually exploitable, but it can only see what it manages to reach and gives no line number. This work uses SAST in the pipeline; the CVE part is a manual dynamic test — a real request is sent to a running server, but the request is written by hand rather than generated by a scanner.</w:t>
       </w:r>
     </w:p>
     <w:p>
@@ -6399,7 +6399,7 @@
           <w:i w:val="0"/>
           <w:sz w:val="20"/>
         </w:rPr>
-        <w:t>Precision: Vulhub pins the exact vulnerable version, so the result is reproducible. Isolation: the vulnerable service cannot damage the host or the network, and stopping it is one command. Hygiene: no old runtime is left installed with its own CVEs. Reset: the environment is rebuilt in seconds after being broken. On this machine Docker was unavailable, and the native reproduction needed extra care with path semantics and a temporary interpreter directory — a practical illustration of the same point.</w:t>
+        <w:t>Precision: Vulhub pins the exact vulnerable version, so the result is reproducible. Isolation: the vulnerable service cannot damage the host or the network, and stopping it is one command. Hygiene: no old runtime is left installed with its own CVEs. Reset: the environment is rebuilt in seconds after being broken. There is a fifth advantage that matters for this particular work: because both images mount the same application and the same target file, the runtime version is the only variable. With a native install the runtime version is a machine-global property — changing it means changing the machine.</w:t>
       </w:r>
     </w:p>
     <w:p>

</xml_diff>

<commit_message>
CVE: add the upstream vulhub request, guard against a busy port 3000, render inline code in the report
</commit_message>
<xml_diff>
--- a/report/Work1-Report.docx
+++ b/report/Work1-Report.docx
@@ -3943,11 +3943,110 @@
       <w:r>
         <w:rPr>
           <w:rFonts w:ascii="Calibri" w:hAnsi="Calibri" w:eastAsia="Calibri"/>
-          <w:b w:val="0"/>
+          <w:b/>
           <w:i w:val="0"/>
           <w:sz w:val="22"/>
         </w:rPr>
-        <w:t>**On the choice of scanners.** The manual suggests `npm audit` or `snyk test` for JavaScript under SAST, and OWASP Dependency-Check or Snyk under SCA. The split is slightly unusual, because `npm audit` is a composition analysis tool: it compares the installed dependency tree against advisory data and never reads the project's own code. This repository therefore uses **ESLint with eslint-plugin-security for SAST** — it inspects our source, which is what static analysis means — and **npm audit for SCA**, which queries the npm advisory database, the same corpus that Dependency-Check consults for JavaScript packages. Both are free, need no account or API key, and run in the pipeline on every push, which satisfies the grading criterion of at least one SAST/SCA tool running in CI.</w:t>
+        <w:t>On the choice of scanners.</w:t>
+      </w:r>
+      <w:r>
+        <w:rPr>
+          <w:rFonts w:ascii="Calibri" w:hAnsi="Calibri" w:eastAsia="Calibri"/>
+          <w:b w:val="0"/>
+          <w:i w:val="0"/>
+          <w:sz w:val="22"/>
+        </w:rPr>
+        <w:t xml:space="preserve"> The manual suggests </w:t>
+      </w:r>
+      <w:r>
+        <w:rPr>
+          <w:rFonts w:ascii="Consolas" w:hAnsi="Consolas" w:eastAsia="Consolas"/>
+          <w:b w:val="0"/>
+          <w:i w:val="0"/>
+          <w:sz w:val="20"/>
+        </w:rPr>
+        <w:t>npm audit</w:t>
+      </w:r>
+      <w:r>
+        <w:rPr>
+          <w:rFonts w:ascii="Calibri" w:hAnsi="Calibri" w:eastAsia="Calibri"/>
+          <w:b w:val="0"/>
+          <w:i w:val="0"/>
+          <w:sz w:val="22"/>
+        </w:rPr>
+        <w:t xml:space="preserve"> or </w:t>
+      </w:r>
+      <w:r>
+        <w:rPr>
+          <w:rFonts w:ascii="Consolas" w:hAnsi="Consolas" w:eastAsia="Consolas"/>
+          <w:b w:val="0"/>
+          <w:i w:val="0"/>
+          <w:sz w:val="20"/>
+        </w:rPr>
+        <w:t>snyk test</w:t>
+      </w:r>
+      <w:r>
+        <w:rPr>
+          <w:rFonts w:ascii="Calibri" w:hAnsi="Calibri" w:eastAsia="Calibri"/>
+          <w:b w:val="0"/>
+          <w:i w:val="0"/>
+          <w:sz w:val="22"/>
+        </w:rPr>
+        <w:t xml:space="preserve"> for JavaScript under SAST, and OWASP Dependency-Check or Snyk under SCA. The split is slightly unusual, because </w:t>
+      </w:r>
+      <w:r>
+        <w:rPr>
+          <w:rFonts w:ascii="Consolas" w:hAnsi="Consolas" w:eastAsia="Consolas"/>
+          <w:b w:val="0"/>
+          <w:i w:val="0"/>
+          <w:sz w:val="20"/>
+        </w:rPr>
+        <w:t>npm audit</w:t>
+      </w:r>
+      <w:r>
+        <w:rPr>
+          <w:rFonts w:ascii="Calibri" w:hAnsi="Calibri" w:eastAsia="Calibri"/>
+          <w:b w:val="0"/>
+          <w:i w:val="0"/>
+          <w:sz w:val="22"/>
+        </w:rPr>
+        <w:t xml:space="preserve"> is a composition analysis tool: it compares the installed dependency tree against advisory data and never reads the project's own code. This repository therefore uses </w:t>
+      </w:r>
+      <w:r>
+        <w:rPr>
+          <w:rFonts w:ascii="Calibri" w:hAnsi="Calibri" w:eastAsia="Calibri"/>
+          <w:b/>
+          <w:i w:val="0"/>
+          <w:sz w:val="22"/>
+        </w:rPr>
+        <w:t>ESLint with eslint-plugin-security for SAST</w:t>
+      </w:r>
+      <w:r>
+        <w:rPr>
+          <w:rFonts w:ascii="Calibri" w:hAnsi="Calibri" w:eastAsia="Calibri"/>
+          <w:b w:val="0"/>
+          <w:i w:val="0"/>
+          <w:sz w:val="22"/>
+        </w:rPr>
+        <w:t xml:space="preserve"> — it inspects our source, which is what static analysis means — and </w:t>
+      </w:r>
+      <w:r>
+        <w:rPr>
+          <w:rFonts w:ascii="Calibri" w:hAnsi="Calibri" w:eastAsia="Calibri"/>
+          <w:b/>
+          <w:i w:val="0"/>
+          <w:sz w:val="22"/>
+        </w:rPr>
+        <w:t>npm audit for SCA</w:t>
+      </w:r>
+      <w:r>
+        <w:rPr>
+          <w:rFonts w:ascii="Calibri" w:hAnsi="Calibri" w:eastAsia="Calibri"/>
+          <w:b w:val="0"/>
+          <w:i w:val="0"/>
+          <w:sz w:val="22"/>
+        </w:rPr>
+        <w:t>, which queries the npm advisory database, the same corpus that Dependency-Check consults for JavaScript packages. Both are free, need no account or API key, and run in the pipeline on every push, which satisfies the grading criterion of at least one SAST/SCA tool running in CI.</w:t>
       </w:r>
     </w:p>
     <w:p>
@@ -4953,6 +5052,86 @@
     </w:p>
     <w:p>
       <w:pPr>
+        <w:shd w:fill="F4F6FA"/>
+        <w:spacing w:before="0" w:after="0" w:line="200" w:lineRule="exact"/>
+        <w:ind w:left="113" w:right="113"/>
+      </w:pPr>
+      <w:r>
+        <w:rPr>
+          <w:rFonts w:ascii="Consolas" w:hAnsi="Consolas" w:eastAsia="Consolas"/>
+          <w:b w:val="0"/>
+          <w:i w:val="0"/>
+          <w:sz w:val="15"/>
+        </w:rPr>
+        <w:t xml:space="preserve"> </w:t>
+      </w:r>
+    </w:p>
+    <w:p>
+      <w:pPr>
+        <w:shd w:fill="F4F6FA"/>
+        <w:spacing w:before="0" w:after="0" w:line="200" w:lineRule="exact"/>
+        <w:ind w:left="113" w:right="113"/>
+      </w:pPr>
+      <w:r>
+        <w:rPr>
+          <w:rFonts w:ascii="Consolas" w:hAnsi="Consolas" w:eastAsia="Consolas"/>
+          <w:b w:val="0"/>
+          <w:i w:val="0"/>
+          <w:sz w:val="15"/>
+        </w:rPr>
+        <w:t># the request printed in the vulhub README: a system file instead</w:t>
+      </w:r>
+    </w:p>
+    <w:p>
+      <w:pPr>
+        <w:shd w:fill="F4F6FA"/>
+        <w:spacing w:before="0" w:after="0" w:line="200" w:lineRule="exact"/>
+        <w:ind w:left="113" w:right="113"/>
+      </w:pPr>
+      <w:r>
+        <w:rPr>
+          <w:rFonts w:ascii="Consolas" w:hAnsi="Consolas" w:eastAsia="Consolas"/>
+          <w:b w:val="0"/>
+          <w:i w:val="0"/>
+          <w:sz w:val="15"/>
+        </w:rPr>
+        <w:t>$ curl --path-as-is -s \</w:t>
+      </w:r>
+    </w:p>
+    <w:p>
+      <w:pPr>
+        <w:shd w:fill="F4F6FA"/>
+        <w:spacing w:before="0" w:after="0" w:line="200" w:lineRule="exact"/>
+        <w:ind w:left="113" w:right="113"/>
+      </w:pPr>
+      <w:r>
+        <w:rPr>
+          <w:rFonts w:ascii="Consolas" w:hAnsi="Consolas" w:eastAsia="Consolas"/>
+          <w:b w:val="0"/>
+          <w:i w:val="0"/>
+          <w:sz w:val="15"/>
+        </w:rPr>
+        <w:t xml:space="preserve">       'http://127.0.0.1:3000/static/../../../a/../../../../etc/passwd'</w:t>
+      </w:r>
+    </w:p>
+    <w:p>
+      <w:pPr>
+        <w:shd w:fill="F4F6FA"/>
+        <w:spacing w:before="0" w:after="0" w:line="200" w:lineRule="exact"/>
+        <w:ind w:left="113" w:right="113"/>
+      </w:pPr>
+      <w:r>
+        <w:rPr>
+          <w:rFonts w:ascii="Consolas" w:hAnsi="Consolas" w:eastAsia="Consolas"/>
+          <w:b w:val="0"/>
+          <w:i w:val="0"/>
+          <w:sz w:val="15"/>
+        </w:rPr>
+        <w:t>root:x:0:0:root:/root:/bin/bash</w:t>
+      </w:r>
+    </w:p>
+    <w:p>
+      <w:pPr>
         <w:spacing w:before="60" w:after="220"/>
         <w:jc w:val="left"/>
       </w:pPr>
@@ -4964,7 +5143,7 @@
           <w:color w:val="555555"/>
           <w:sz w:val="18"/>
         </w:rPr>
-        <w:t>Terminal transcript: the traversal succeeds inside the container running Node 8.5.0.</w:t>
+        <w:t>Terminal transcript: the traversal succeeds inside the container running Node 8.5.0, on a mounted file and on a system file that was never part of the image.</w:t>
       </w:r>
     </w:p>
     <w:p>
@@ -4979,7 +5158,43 @@
           <w:i w:val="0"/>
           <w:sz w:val="22"/>
         </w:rPr>
-        <w:t>Both runs were executed by `cve/CVE-2017-14849/verify-docker.ps1`, which builds each image, waits until the application actually answers HTTP 200, issues the requests and writes the whole session to `cve/CVE-2017-14849/docker-evidence.txt` in the repository. That transcript is the raw evidence; the figures below show the same requests against the same application on the native runtime, where a window capture was possible.</w:t>
+        <w:t xml:space="preserve">Both runs were executed by </w:t>
+      </w:r>
+      <w:r>
+        <w:rPr>
+          <w:rFonts w:ascii="Consolas" w:hAnsi="Consolas" w:eastAsia="Consolas"/>
+          <w:b w:val="0"/>
+          <w:i w:val="0"/>
+          <w:sz w:val="20"/>
+        </w:rPr>
+        <w:t>cve/CVE-2017-14849/verify-docker.ps1</w:t>
+      </w:r>
+      <w:r>
+        <w:rPr>
+          <w:rFonts w:ascii="Calibri" w:hAnsi="Calibri" w:eastAsia="Calibri"/>
+          <w:b w:val="0"/>
+          <w:i w:val="0"/>
+          <w:sz w:val="22"/>
+        </w:rPr>
+        <w:t xml:space="preserve">, which builds each image, waits until the application actually answers HTTP 200, issues the requests and writes the whole session to </w:t>
+      </w:r>
+      <w:r>
+        <w:rPr>
+          <w:rFonts w:ascii="Consolas" w:hAnsi="Consolas" w:eastAsia="Consolas"/>
+          <w:b w:val="0"/>
+          <w:i w:val="0"/>
+          <w:sz w:val="20"/>
+        </w:rPr>
+        <w:t>cve/CVE-2017-14849/docker-evidence.txt</w:t>
+      </w:r>
+      <w:r>
+        <w:rPr>
+          <w:rFonts w:ascii="Calibri" w:hAnsi="Calibri" w:eastAsia="Calibri"/>
+          <w:b w:val="0"/>
+          <w:i w:val="0"/>
+          <w:sz w:val="22"/>
+        </w:rPr>
+        <w:t xml:space="preserve"> in the repository. That transcript is the raw evidence; the figures below show the same requests against the same application on the native runtime, where a window capture was possible.</w:t>
       </w:r>
     </w:p>
     <w:p>
@@ -5122,6 +5337,54 @@
           <w:i w:val="0"/>
           <w:sz w:val="15"/>
         </w:rPr>
+        <w:t>$ curl --path-as-is -s -o /dev/null -w '%{http_code}' \</w:t>
+      </w:r>
+    </w:p>
+    <w:p>
+      <w:pPr>
+        <w:shd w:fill="F4F6FA"/>
+        <w:spacing w:before="0" w:after="0" w:line="200" w:lineRule="exact"/>
+        <w:ind w:left="113" w:right="113"/>
+      </w:pPr>
+      <w:r>
+        <w:rPr>
+          <w:rFonts w:ascii="Consolas" w:hAnsi="Consolas" w:eastAsia="Consolas"/>
+          <w:b w:val="0"/>
+          <w:i w:val="0"/>
+          <w:sz w:val="15"/>
+        </w:rPr>
+        <w:t xml:space="preserve">       'http://127.0.0.1:3000/static/../../../a/../../../../etc/passwd'</w:t>
+      </w:r>
+    </w:p>
+    <w:p>
+      <w:pPr>
+        <w:shd w:fill="F4F6FA"/>
+        <w:spacing w:before="0" w:after="0" w:line="200" w:lineRule="exact"/>
+        <w:ind w:left="113" w:right="113"/>
+      </w:pPr>
+      <w:r>
+        <w:rPr>
+          <w:rFonts w:ascii="Consolas" w:hAnsi="Consolas" w:eastAsia="Consolas"/>
+          <w:b w:val="0"/>
+          <w:i w:val="0"/>
+          <w:sz w:val="15"/>
+        </w:rPr>
+        <w:t>404</w:t>
+      </w:r>
+    </w:p>
+    <w:p>
+      <w:pPr>
+        <w:shd w:fill="F4F6FA"/>
+        <w:spacing w:before="0" w:after="0" w:line="200" w:lineRule="exact"/>
+        <w:ind w:left="113" w:right="113"/>
+      </w:pPr>
+      <w:r>
+        <w:rPr>
+          <w:rFonts w:ascii="Consolas" w:hAnsi="Consolas" w:eastAsia="Consolas"/>
+          <w:b w:val="0"/>
+          <w:i w:val="0"/>
+          <w:sz w:val="15"/>
+        </w:rPr>
         <w:t>$ curl --path-as-is -s -o /dev/null -w '%{http_code}' http://127.0.0.1:3000/static/main.js</w:t>
       </w:r>
     </w:p>
@@ -5154,7 +5417,7 @@
           <w:color w:val="555555"/>
           <w:sz w:val="18"/>
         </w:rPr>
-        <w:t>Terminal transcript: identical request, fixed runtime — rejected, and normal requests are still served. Full transcript in evidence/shot-docker and docker-evidence.txt.</w:t>
+        <w:t>Terminal transcript: both traversal requests are rejected on the fixed runtime, and normal requests are still served. Full transcript in docker-evidence.txt.</w:t>
       </w:r>
     </w:p>
     <w:p>

</xml_diff>